<commit_message>
Cahier des spécifications fonctionnelles version finale
</commit_message>
<xml_diff>
--- a/Cahier des spécifications fonctionnelles vc.docx
+++ b/Cahier des spécifications fonctionnelles vc.docx
@@ -146,6 +146,8 @@
       <w:bookmarkStart w:id="4" w:name="_Toc238460667"/>
       <w:bookmarkStart w:id="5" w:name="_Toc239060547"/>
       <w:bookmarkStart w:id="6" w:name="_Toc239060591"/>
+      <w:bookmarkStart w:id="7" w:name="_Toc239152312"/>
+      <w:bookmarkStart w:id="8" w:name="_Toc239152419"/>
       <w:r>
         <w:rPr>
           <w:rFonts w:eastAsia="Calibri"/>
@@ -164,6 +166,8 @@
       <w:bookmarkEnd w:id="4"/>
       <w:bookmarkEnd w:id="5"/>
       <w:bookmarkEnd w:id="6"/>
+      <w:bookmarkEnd w:id="7"/>
+      <w:bookmarkEnd w:id="8"/>
     </w:p>
     <w:p>
       <w:pPr>
@@ -200,7 +204,7 @@
         </w:rPr>
         <w:fldChar w:fldCharType="separate"/>
       </w:r>
-      <w:hyperlink w:anchor="_Toc239060591" w:history="1">
+      <w:hyperlink w:anchor="_Toc239152419" w:history="1">
         <w:r>
           <w:rPr>
             <w:rStyle w:val="Lienhypertexte"/>
@@ -238,7 +242,7 @@
             <w:sz w:val="24"/>
             <w:szCs w:val="24"/>
           </w:rPr>
-          <w:instrText xml:space="preserve"> PAGEREF _Toc239060591 \h </w:instrText>
+          <w:instrText xml:space="preserve"> PAGEREF _Toc239152419 \h </w:instrText>
         </w:r>
         <w:r>
           <w:rPr>
@@ -291,7 +295,7 @@
           <w:szCs w:val="24"/>
         </w:rPr>
       </w:pPr>
-      <w:hyperlink w:anchor="_Toc239060592" w:history="1">
+      <w:hyperlink w:anchor="_Toc239152420" w:history="1">
         <w:r>
           <w:rPr>
             <w:rStyle w:val="Lienhypertexte"/>
@@ -329,7 +333,7 @@
             <w:sz w:val="24"/>
             <w:szCs w:val="24"/>
           </w:rPr>
-          <w:instrText xml:space="preserve"> PAGEREF _Toc239060592 \h </w:instrText>
+          <w:instrText xml:space="preserve"> PAGEREF _Toc239152420 \h </w:instrText>
         </w:r>
         <w:r>
           <w:rPr>
@@ -382,7 +386,7 @@
           <w:szCs w:val="24"/>
         </w:rPr>
       </w:pPr>
-      <w:hyperlink w:anchor="_Toc239060593" w:history="1">
+      <w:hyperlink w:anchor="_Toc239152421" w:history="1">
         <w:r>
           <w:rPr>
             <w:rStyle w:val="Lienhypertexte"/>
@@ -420,7 +424,7 @@
             <w:sz w:val="24"/>
             <w:szCs w:val="24"/>
           </w:rPr>
-          <w:instrText xml:space="preserve"> PAGEREF _Toc239060593 \h </w:instrText>
+          <w:instrText xml:space="preserve"> PAGEREF _Toc239152421 \h </w:instrText>
         </w:r>
         <w:r>
           <w:rPr>
@@ -473,7 +477,7 @@
           <w:szCs w:val="24"/>
         </w:rPr>
       </w:pPr>
-      <w:hyperlink w:anchor="_Toc239060594" w:history="1">
+      <w:hyperlink w:anchor="_Toc239152422" w:history="1">
         <w:r>
           <w:rPr>
             <w:rStyle w:val="Lienhypertexte"/>
@@ -511,7 +515,7 @@
             <w:sz w:val="24"/>
             <w:szCs w:val="24"/>
           </w:rPr>
-          <w:instrText xml:space="preserve"> PAGEREF _Toc239060594 \h </w:instrText>
+          <w:instrText xml:space="preserve"> PAGEREF _Toc239152422 \h </w:instrText>
         </w:r>
         <w:r>
           <w:rPr>
@@ -564,7 +568,7 @@
           <w:szCs w:val="24"/>
         </w:rPr>
       </w:pPr>
-      <w:hyperlink w:anchor="_Toc239060597" w:history="1">
+      <w:hyperlink w:anchor="_Toc239152425" w:history="1">
         <w:r>
           <w:rPr>
             <w:rStyle w:val="Lienhypertexte"/>
@@ -602,7 +606,7 @@
             <w:sz w:val="24"/>
             <w:szCs w:val="24"/>
           </w:rPr>
-          <w:instrText xml:space="preserve"> PAGEREF _Toc239060597 \h </w:instrText>
+          <w:instrText xml:space="preserve"> PAGEREF _Toc239152425 \h </w:instrText>
         </w:r>
         <w:r>
           <w:rPr>
@@ -655,7 +659,7 @@
           <w:szCs w:val="24"/>
         </w:rPr>
       </w:pPr>
-      <w:hyperlink w:anchor="_Toc239060598" w:history="1">
+      <w:hyperlink w:anchor="_Toc239152428" w:history="1">
         <w:r>
           <w:rPr>
             <w:rStyle w:val="Lienhypertexte"/>
@@ -692,7 +696,7 @@
             <w:sz w:val="24"/>
             <w:szCs w:val="24"/>
           </w:rPr>
-          <w:instrText xml:space="preserve"> PAGEREF _Toc239060598 \h </w:instrText>
+          <w:instrText xml:space="preserve"> PAGEREF _Toc239152428 \h </w:instrText>
         </w:r>
         <w:r>
           <w:rPr>
@@ -745,7 +749,7 @@
           <w:szCs w:val="24"/>
         </w:rPr>
       </w:pPr>
-      <w:hyperlink w:anchor="_Toc239060606" w:history="1">
+      <w:hyperlink w:anchor="_Toc239152436" w:history="1">
         <w:r>
           <w:rPr>
             <w:rStyle w:val="Lienhypertexte"/>
@@ -782,7 +786,7 @@
             <w:sz w:val="24"/>
             <w:szCs w:val="24"/>
           </w:rPr>
-          <w:instrText xml:space="preserve"> PAGEREF _Toc239060606 \h </w:instrText>
+          <w:instrText xml:space="preserve"> PAGEREF _Toc239152436 \h </w:instrText>
         </w:r>
         <w:r>
           <w:rPr>
@@ -808,7 +812,7 @@
             <w:sz w:val="24"/>
             <w:szCs w:val="24"/>
           </w:rPr>
-          <w:t>9</w:t>
+          <w:t>10</w:t>
         </w:r>
         <w:r>
           <w:rPr>
@@ -835,7 +839,7 @@
           <w:szCs w:val="24"/>
         </w:rPr>
       </w:pPr>
-      <w:hyperlink w:anchor="_Toc239060607" w:history="1">
+      <w:hyperlink w:anchor="_Toc239152437" w:history="1">
         <w:r>
           <w:rPr>
             <w:rStyle w:val="Lienhypertexte"/>
@@ -873,7 +877,7 @@
             <w:sz w:val="24"/>
             <w:szCs w:val="24"/>
           </w:rPr>
-          <w:instrText xml:space="preserve"> PAGEREF _Toc239060607 \h </w:instrText>
+          <w:instrText xml:space="preserve"> PAGEREF _Toc239152437 \h </w:instrText>
         </w:r>
         <w:r>
           <w:rPr>
@@ -942,13 +946,15 @@
         <w:spacing w:before="400" w:after="200" w:line="360" w:lineRule="auto"/>
         <w:jc w:val="both"/>
       </w:pPr>
-      <w:bookmarkStart w:id="7" w:name="_Toc238413361"/>
-      <w:bookmarkStart w:id="8" w:name="_Toc238413434"/>
-      <w:bookmarkStart w:id="9" w:name="_Toc238460267"/>
-      <w:bookmarkStart w:id="10" w:name="_Toc238460610"/>
-      <w:bookmarkStart w:id="11" w:name="_Toc238460668"/>
-      <w:bookmarkStart w:id="12" w:name="_Toc239060548"/>
-      <w:bookmarkStart w:id="13" w:name="_Toc239060592"/>
+      <w:bookmarkStart w:id="9" w:name="_Toc238413361"/>
+      <w:bookmarkStart w:id="10" w:name="_Toc238413434"/>
+      <w:bookmarkStart w:id="11" w:name="_Toc238460267"/>
+      <w:bookmarkStart w:id="12" w:name="_Toc238460610"/>
+      <w:bookmarkStart w:id="13" w:name="_Toc238460668"/>
+      <w:bookmarkStart w:id="14" w:name="_Toc239060548"/>
+      <w:bookmarkStart w:id="15" w:name="_Toc239060592"/>
+      <w:bookmarkStart w:id="16" w:name="_Toc239152313"/>
+      <w:bookmarkStart w:id="17" w:name="_Toc239152420"/>
       <w:r>
         <w:rPr>
           <w:rFonts w:eastAsia="Calibri"/>
@@ -960,8 +966,8 @@
         <w:lastRenderedPageBreak/>
         <w:t xml:space="preserve">1. </w:t>
       </w:r>
-      <w:bookmarkEnd w:id="7"/>
-      <w:bookmarkEnd w:id="8"/>
+      <w:bookmarkEnd w:id="9"/>
+      <w:bookmarkEnd w:id="10"/>
       <w:r>
         <w:rPr>
           <w:rFonts w:eastAsia="Calibri"/>
@@ -972,11 +978,13 @@
         </w:rPr>
         <w:t>Objet du document</w:t>
       </w:r>
-      <w:bookmarkEnd w:id="9"/>
-      <w:bookmarkEnd w:id="10"/>
       <w:bookmarkEnd w:id="11"/>
       <w:bookmarkEnd w:id="12"/>
       <w:bookmarkEnd w:id="13"/>
+      <w:bookmarkEnd w:id="14"/>
+      <w:bookmarkEnd w:id="15"/>
+      <w:bookmarkEnd w:id="16"/>
+      <w:bookmarkEnd w:id="17"/>
     </w:p>
     <w:p>
       <w:pPr>
@@ -1032,13 +1040,15 @@
         <w:spacing w:before="400" w:after="200" w:line="360" w:lineRule="auto"/>
         <w:jc w:val="both"/>
       </w:pPr>
-      <w:bookmarkStart w:id="14" w:name="_Toc238413362"/>
-      <w:bookmarkStart w:id="15" w:name="_Toc238413435"/>
-      <w:bookmarkStart w:id="16" w:name="_Toc238460268"/>
-      <w:bookmarkStart w:id="17" w:name="_Toc238460611"/>
-      <w:bookmarkStart w:id="18" w:name="_Toc238460669"/>
-      <w:bookmarkStart w:id="19" w:name="_Toc239060549"/>
-      <w:bookmarkStart w:id="20" w:name="_Toc239060593"/>
+      <w:bookmarkStart w:id="18" w:name="_Toc238413362"/>
+      <w:bookmarkStart w:id="19" w:name="_Toc238413435"/>
+      <w:bookmarkStart w:id="20" w:name="_Toc238460268"/>
+      <w:bookmarkStart w:id="21" w:name="_Toc238460611"/>
+      <w:bookmarkStart w:id="22" w:name="_Toc238460669"/>
+      <w:bookmarkStart w:id="23" w:name="_Toc239060549"/>
+      <w:bookmarkStart w:id="24" w:name="_Toc239060593"/>
+      <w:bookmarkStart w:id="25" w:name="_Toc239152314"/>
+      <w:bookmarkStart w:id="26" w:name="_Toc239152421"/>
       <w:r>
         <w:rPr>
           <w:rFonts w:eastAsia="Calibri"/>
@@ -1049,8 +1059,8 @@
         </w:rPr>
         <w:t xml:space="preserve">2. </w:t>
       </w:r>
-      <w:bookmarkEnd w:id="14"/>
-      <w:bookmarkEnd w:id="15"/>
+      <w:bookmarkEnd w:id="18"/>
+      <w:bookmarkEnd w:id="19"/>
       <w:r>
         <w:rPr>
           <w:rFonts w:eastAsia="Calibri"/>
@@ -1061,11 +1071,13 @@
         </w:rPr>
         <w:t>Acteurs du système</w:t>
       </w:r>
-      <w:bookmarkEnd w:id="16"/>
-      <w:bookmarkEnd w:id="17"/>
-      <w:bookmarkEnd w:id="18"/>
-      <w:bookmarkEnd w:id="19"/>
       <w:bookmarkEnd w:id="20"/>
+      <w:bookmarkEnd w:id="21"/>
+      <w:bookmarkEnd w:id="22"/>
+      <w:bookmarkEnd w:id="23"/>
+      <w:bookmarkEnd w:id="24"/>
+      <w:bookmarkEnd w:id="25"/>
+      <w:bookmarkEnd w:id="26"/>
     </w:p>
     <w:tbl>
       <w:tblPr>
@@ -1186,13 +1198,15 @@
           <w:szCs w:val="30"/>
         </w:rPr>
       </w:pPr>
-      <w:bookmarkStart w:id="21" w:name="_Toc238413363"/>
-      <w:bookmarkStart w:id="22" w:name="_Toc238413436"/>
-      <w:bookmarkStart w:id="23" w:name="_Toc238460269"/>
-      <w:bookmarkStart w:id="24" w:name="_Toc238460612"/>
-      <w:bookmarkStart w:id="25" w:name="_Toc238460670"/>
-      <w:bookmarkStart w:id="26" w:name="_Toc239060550"/>
-      <w:bookmarkStart w:id="27" w:name="_Toc239060594"/>
+      <w:bookmarkStart w:id="27" w:name="_Toc238413363"/>
+      <w:bookmarkStart w:id="28" w:name="_Toc238413436"/>
+      <w:bookmarkStart w:id="29" w:name="_Toc238460269"/>
+      <w:bookmarkStart w:id="30" w:name="_Toc238460612"/>
+      <w:bookmarkStart w:id="31" w:name="_Toc238460670"/>
+      <w:bookmarkStart w:id="32" w:name="_Toc239060550"/>
+      <w:bookmarkStart w:id="33" w:name="_Toc239060594"/>
+      <w:bookmarkStart w:id="34" w:name="_Toc239152315"/>
+      <w:bookmarkStart w:id="35" w:name="_Toc239152422"/>
       <w:r>
         <w:rPr>
           <w:rFonts w:eastAsia="Calibri"/>
@@ -1203,8 +1217,8 @@
         </w:rPr>
         <w:t xml:space="preserve">3. </w:t>
       </w:r>
-      <w:bookmarkEnd w:id="21"/>
-      <w:bookmarkEnd w:id="22"/>
+      <w:bookmarkEnd w:id="27"/>
+      <w:bookmarkEnd w:id="28"/>
       <w:r>
         <w:rPr>
           <w:rFonts w:eastAsia="Calibri"/>
@@ -1215,11 +1229,13 @@
         </w:rPr>
         <w:t>Diagramme de cas d’utilisation</w:t>
       </w:r>
-      <w:bookmarkEnd w:id="23"/>
-      <w:bookmarkEnd w:id="24"/>
-      <w:bookmarkEnd w:id="25"/>
-      <w:bookmarkEnd w:id="26"/>
-      <w:bookmarkEnd w:id="27"/>
+      <w:bookmarkEnd w:id="29"/>
+      <w:bookmarkEnd w:id="30"/>
+      <w:bookmarkEnd w:id="31"/>
+      <w:bookmarkEnd w:id="32"/>
+      <w:bookmarkEnd w:id="33"/>
+      <w:bookmarkEnd w:id="34"/>
+      <w:bookmarkEnd w:id="35"/>
     </w:p>
     <w:p>
       <w:pPr>
@@ -1233,6 +1249,9 @@
         <w:jc w:val="center"/>
       </w:pPr>
       <w:r>
+        <w:rPr>
+          <w:noProof/>
+        </w:rPr>
         <w:drawing>
           <wp:inline distT="0" distB="0" distL="0" distR="0" wp14:anchorId="6ACB4EC8" wp14:editId="517917D5">
             <wp:extent cx="6134175" cy="4191000"/>
@@ -1297,14 +1316,16 @@
           <w:szCs w:val="28"/>
         </w:rPr>
       </w:pPr>
-      <w:bookmarkStart w:id="28" w:name="_Toc238412447"/>
-      <w:bookmarkStart w:id="29" w:name="_Toc238413364"/>
-      <w:bookmarkStart w:id="30" w:name="_Toc238413437"/>
-      <w:bookmarkStart w:id="31" w:name="_Toc238460270"/>
-      <w:bookmarkStart w:id="32" w:name="_Toc238460613"/>
-      <w:bookmarkStart w:id="33" w:name="_Toc238460671"/>
-      <w:bookmarkStart w:id="34" w:name="_Toc239060551"/>
-      <w:bookmarkStart w:id="35" w:name="_Toc239060595"/>
+      <w:bookmarkStart w:id="36" w:name="_Toc238412447"/>
+      <w:bookmarkStart w:id="37" w:name="_Toc238413364"/>
+      <w:bookmarkStart w:id="38" w:name="_Toc238413437"/>
+      <w:bookmarkStart w:id="39" w:name="_Toc238460270"/>
+      <w:bookmarkStart w:id="40" w:name="_Toc238460613"/>
+      <w:bookmarkStart w:id="41" w:name="_Toc238460671"/>
+      <w:bookmarkStart w:id="42" w:name="_Toc239060551"/>
+      <w:bookmarkStart w:id="43" w:name="_Toc239060595"/>
+      <w:bookmarkStart w:id="44" w:name="_Toc239152316"/>
+      <w:bookmarkStart w:id="45" w:name="_Toc239152423"/>
       <w:r>
         <w:rPr>
           <w:rFonts w:eastAsia="Calibri"/>
@@ -1316,9 +1337,9 @@
         <w:lastRenderedPageBreak/>
         <w:t xml:space="preserve">3.1 </w:t>
       </w:r>
-      <w:bookmarkEnd w:id="28"/>
-      <w:bookmarkEnd w:id="29"/>
-      <w:bookmarkEnd w:id="30"/>
+      <w:bookmarkEnd w:id="36"/>
+      <w:bookmarkEnd w:id="37"/>
+      <w:bookmarkEnd w:id="38"/>
       <w:r>
         <w:rPr>
           <w:rFonts w:eastAsia="Calibri"/>
@@ -1329,11 +1350,13 @@
         </w:rPr>
         <w:t>Liste des cas d’utilisation</w:t>
       </w:r>
-      <w:bookmarkEnd w:id="31"/>
-      <w:bookmarkEnd w:id="32"/>
-      <w:bookmarkEnd w:id="33"/>
-      <w:bookmarkEnd w:id="34"/>
-      <w:bookmarkEnd w:id="35"/>
+      <w:bookmarkEnd w:id="39"/>
+      <w:bookmarkEnd w:id="40"/>
+      <w:bookmarkEnd w:id="41"/>
+      <w:bookmarkEnd w:id="42"/>
+      <w:bookmarkEnd w:id="43"/>
+      <w:bookmarkEnd w:id="44"/>
+      <w:bookmarkEnd w:id="45"/>
     </w:p>
     <w:tbl>
       <w:tblPr>
@@ -1776,29 +1799,21 @@
     </w:tbl>
     <w:p>
       <w:pPr>
-        <w:spacing w:after="150" w:line="360" w:lineRule="auto"/>
-        <w:jc w:val="both"/>
-        <w:rPr>
-          <w:sz w:val="24"/>
-          <w:szCs w:val="24"/>
-        </w:rPr>
-      </w:pPr>
-    </w:p>
-    <w:p>
-      <w:pPr>
         <w:pStyle w:val="Titre2"/>
         <w:spacing w:before="300" w:after="150" w:line="360" w:lineRule="auto"/>
-        <w:ind w:firstLine="360"/>
+        <w:ind w:firstLine="708"/>
         <w:jc w:val="both"/>
       </w:pPr>
-      <w:bookmarkStart w:id="36" w:name="_Toc238412448"/>
-      <w:bookmarkStart w:id="37" w:name="_Toc238413365"/>
-      <w:bookmarkStart w:id="38" w:name="_Toc238413438"/>
-      <w:bookmarkStart w:id="39" w:name="_Toc238460271"/>
-      <w:bookmarkStart w:id="40" w:name="_Toc238460614"/>
-      <w:bookmarkStart w:id="41" w:name="_Toc238460672"/>
-      <w:bookmarkStart w:id="42" w:name="_Toc239060552"/>
-      <w:bookmarkStart w:id="43" w:name="_Toc239060596"/>
+      <w:bookmarkStart w:id="46" w:name="_Toc238412448"/>
+      <w:bookmarkStart w:id="47" w:name="_Toc238413365"/>
+      <w:bookmarkStart w:id="48" w:name="_Toc238413438"/>
+      <w:bookmarkStart w:id="49" w:name="_Toc238460271"/>
+      <w:bookmarkStart w:id="50" w:name="_Toc238460614"/>
+      <w:bookmarkStart w:id="51" w:name="_Toc238460672"/>
+      <w:bookmarkStart w:id="52" w:name="_Toc239060552"/>
+      <w:bookmarkStart w:id="53" w:name="_Toc239060596"/>
+      <w:bookmarkStart w:id="54" w:name="_Toc239152317"/>
+      <w:bookmarkStart w:id="55" w:name="_Toc239152424"/>
       <w:r>
         <w:rPr>
           <w:rFonts w:eastAsia="Calibri"/>
@@ -1809,9 +1824,9 @@
         </w:rPr>
         <w:t xml:space="preserve">3.2 </w:t>
       </w:r>
-      <w:bookmarkEnd w:id="36"/>
-      <w:bookmarkEnd w:id="37"/>
-      <w:bookmarkEnd w:id="38"/>
+      <w:bookmarkEnd w:id="46"/>
+      <w:bookmarkEnd w:id="47"/>
+      <w:bookmarkEnd w:id="48"/>
       <w:r>
         <w:rPr>
           <w:rFonts w:eastAsia="Calibri"/>
@@ -1822,11 +1837,13 @@
         </w:rPr>
         <w:t>Relations entre cas d’utilisation</w:t>
       </w:r>
-      <w:bookmarkEnd w:id="39"/>
-      <w:bookmarkEnd w:id="40"/>
-      <w:bookmarkEnd w:id="41"/>
-      <w:bookmarkEnd w:id="42"/>
-      <w:bookmarkEnd w:id="43"/>
+      <w:bookmarkEnd w:id="49"/>
+      <w:bookmarkEnd w:id="50"/>
+      <w:bookmarkEnd w:id="51"/>
+      <w:bookmarkEnd w:id="52"/>
+      <w:bookmarkEnd w:id="53"/>
+      <w:bookmarkEnd w:id="54"/>
+      <w:bookmarkEnd w:id="55"/>
     </w:p>
     <w:p>
       <w:pPr>
@@ -2011,15 +2028,6 @@
         <w:pStyle w:val="Titre1"/>
         <w:spacing w:before="400" w:after="200" w:line="360" w:lineRule="auto"/>
         <w:jc w:val="both"/>
-      </w:pPr>
-      <w:bookmarkStart w:id="44" w:name="_Toc238413366"/>
-      <w:bookmarkStart w:id="45" w:name="_Toc238413439"/>
-      <w:bookmarkStart w:id="46" w:name="_Toc238460272"/>
-      <w:bookmarkStart w:id="47" w:name="_Toc238460615"/>
-      <w:bookmarkStart w:id="48" w:name="_Toc238460673"/>
-      <w:bookmarkStart w:id="49" w:name="_Toc239060553"/>
-      <w:bookmarkStart w:id="50" w:name="_Toc239060597"/>
-      <w:r>
         <w:rPr>
           <w:rFonts w:eastAsia="Calibri"/>
           <w:b/>
@@ -2027,10 +2035,16 @@
           <w:sz w:val="30"/>
           <w:szCs w:val="30"/>
         </w:rPr>
-        <w:t xml:space="preserve">4. </w:t>
-      </w:r>
-      <w:bookmarkEnd w:id="44"/>
-      <w:bookmarkEnd w:id="45"/>
+      </w:pPr>
+      <w:bookmarkStart w:id="56" w:name="_Toc238413366"/>
+      <w:bookmarkStart w:id="57" w:name="_Toc238413439"/>
+      <w:bookmarkStart w:id="58" w:name="_Toc238460272"/>
+      <w:bookmarkStart w:id="59" w:name="_Toc238460615"/>
+      <w:bookmarkStart w:id="60" w:name="_Toc238460673"/>
+      <w:bookmarkStart w:id="61" w:name="_Toc239060553"/>
+      <w:bookmarkStart w:id="62" w:name="_Toc239060597"/>
+      <w:bookmarkStart w:id="63" w:name="_Toc239152318"/>
+      <w:bookmarkStart w:id="64" w:name="_Toc239152425"/>
       <w:r>
         <w:rPr>
           <w:rFonts w:eastAsia="Calibri"/>
@@ -2039,23 +2053,116 @@
           <w:sz w:val="30"/>
           <w:szCs w:val="30"/>
         </w:rPr>
+        <w:t xml:space="preserve">4. </w:t>
+      </w:r>
+      <w:bookmarkEnd w:id="56"/>
+      <w:bookmarkEnd w:id="57"/>
+      <w:r>
+        <w:rPr>
+          <w:rFonts w:eastAsia="Calibri"/>
+          <w:b/>
+          <w:bCs/>
+          <w:sz w:val="30"/>
+          <w:szCs w:val="30"/>
+        </w:rPr>
         <w:t>Règles de gestion</w:t>
       </w:r>
-      <w:bookmarkEnd w:id="46"/>
-      <w:bookmarkEnd w:id="47"/>
-      <w:bookmarkEnd w:id="48"/>
-      <w:bookmarkEnd w:id="49"/>
-      <w:bookmarkEnd w:id="50"/>
-    </w:p>
-    <w:p>
-      <w:pPr>
-        <w:pStyle w:val="NormalWeb"/>
+      <w:bookmarkEnd w:id="58"/>
+      <w:bookmarkEnd w:id="59"/>
+      <w:bookmarkEnd w:id="60"/>
+      <w:bookmarkEnd w:id="61"/>
+      <w:bookmarkEnd w:id="62"/>
+      <w:bookmarkEnd w:id="63"/>
+      <w:bookmarkEnd w:id="64"/>
+    </w:p>
+    <w:p>
+      <w:pPr>
         <w:spacing w:line="360" w:lineRule="auto"/>
         <w:jc w:val="both"/>
-      </w:pPr>
-      <w:r>
+        <w:rPr>
+          <w:sz w:val="24"/>
+          <w:szCs w:val="24"/>
+        </w:rPr>
+      </w:pPr>
+      <w:r>
+        <w:rPr>
+          <w:sz w:val="24"/>
+          <w:szCs w:val="24"/>
+        </w:rPr>
         <w:t>Les règles de gestion suivantes s'appliquent de façon transversale à plusieurs cas d'utilisation. Elles sont codifiées ici pour être référencées précisément dans la suite du document.</w:t>
       </w:r>
+    </w:p>
+    <w:p>
+      <w:pPr>
+        <w:pStyle w:val="Titre2"/>
+        <w:spacing w:before="300" w:after="150" w:line="360" w:lineRule="auto"/>
+        <w:ind w:firstLine="708"/>
+        <w:jc w:val="both"/>
+      </w:pPr>
+      <w:bookmarkStart w:id="65" w:name="_Toc239152319"/>
+      <w:bookmarkStart w:id="66" w:name="_Toc239152426"/>
+      <w:r>
+        <w:rPr>
+          <w:rFonts w:eastAsia="Calibri"/>
+          <w:b/>
+          <w:bCs/>
+          <w:sz w:val="28"/>
+          <w:szCs w:val="28"/>
+        </w:rPr>
+        <w:t>4</w:t>
+      </w:r>
+      <w:r>
+        <w:rPr>
+          <w:rFonts w:eastAsia="Calibri"/>
+          <w:b/>
+          <w:bCs/>
+          <w:sz w:val="28"/>
+          <w:szCs w:val="28"/>
+        </w:rPr>
+        <w:t>.</w:t>
+      </w:r>
+      <w:r>
+        <w:rPr>
+          <w:rFonts w:eastAsia="Calibri"/>
+          <w:b/>
+          <w:bCs/>
+          <w:sz w:val="28"/>
+          <w:szCs w:val="28"/>
+        </w:rPr>
+        <w:t>1</w:t>
+      </w:r>
+      <w:r>
+        <w:rPr>
+          <w:rFonts w:eastAsia="Calibri"/>
+          <w:b/>
+          <w:bCs/>
+          <w:sz w:val="28"/>
+          <w:szCs w:val="28"/>
+        </w:rPr>
+        <w:t xml:space="preserve"> </w:t>
+      </w:r>
+      <w:r>
+        <w:rPr>
+          <w:rFonts w:eastAsia="Calibri"/>
+          <w:b/>
+          <w:bCs/>
+          <w:sz w:val="28"/>
+          <w:szCs w:val="28"/>
+        </w:rPr>
+        <w:t>R</w:t>
+      </w:r>
+      <w:r>
+        <w:rPr>
+          <w:rFonts w:eastAsia="Calibri"/>
+          <w:b/>
+          <w:bCs/>
+          <w:sz w:val="28"/>
+          <w:szCs w:val="28"/>
+        </w:rPr>
+        <w:t>ègles applicables aux opérations (dépôt et retrait)</w:t>
+      </w:r>
+      <w:bookmarkEnd w:id="65"/>
+      <w:bookmarkEnd w:id="66"/>
     </w:p>
     <w:tbl>
       <w:tblPr>
@@ -2227,6 +2334,7 @@
                 <w:sz w:val="24"/>
                 <w:szCs w:val="24"/>
               </w:rPr>
+              <w:lastRenderedPageBreak/>
               <w:t>RG3</w:t>
             </w:r>
           </w:p>
@@ -2265,15 +2373,7 @@
                 <w:sz w:val="24"/>
                 <w:szCs w:val="24"/>
               </w:rPr>
-              <w:t xml:space="preserve"> que la date d'échéance n'est pas </w:t>
-            </w:r>
-            <w:r>
-              <w:rPr>
-                <w:sz w:val="24"/>
-                <w:szCs w:val="24"/>
-              </w:rPr>
-              <w:lastRenderedPageBreak/>
-              <w:t>arrivée (le retrait est autorisé dès que l'une des deux conditions est remplie).</w:t>
+              <w:t xml:space="preserve"> que la date d'échéance n'est pas arrivée (le retrait est autorisé dès que l'une des deux conditions est remplie).</w:t>
             </w:r>
           </w:p>
         </w:tc>
@@ -2296,7 +2396,6 @@
                 <w:sz w:val="24"/>
                 <w:szCs w:val="24"/>
               </w:rPr>
-              <w:lastRenderedPageBreak/>
               <w:t>RG4</w:t>
             </w:r>
           </w:p>
@@ -2326,17 +2425,266 @@
     </w:tbl>
     <w:p>
       <w:pPr>
-        <w:pStyle w:val="Titre1"/>
-        <w:spacing w:line="360" w:lineRule="auto"/>
+        <w:pStyle w:val="Titre2"/>
+        <w:spacing w:before="300" w:after="150" w:line="360" w:lineRule="auto"/>
+        <w:ind w:firstLine="708"/>
         <w:jc w:val="both"/>
-        <w:rPr>
+      </w:pPr>
+      <w:bookmarkStart w:id="67" w:name="_Toc238413369"/>
+      <w:bookmarkStart w:id="68" w:name="_Toc238413442"/>
+      <w:bookmarkStart w:id="69" w:name="_Toc239152320"/>
+      <w:bookmarkStart w:id="70" w:name="_Toc239152427"/>
+      <w:r>
+        <w:rPr>
+          <w:rFonts w:eastAsia="Calibri"/>
           <w:b/>
           <w:bCs/>
-        </w:rPr>
-      </w:pPr>
-      <w:bookmarkStart w:id="51" w:name="_Toc238413369"/>
-      <w:bookmarkStart w:id="52" w:name="_Toc238413442"/>
-    </w:p>
+          <w:sz w:val="28"/>
+          <w:szCs w:val="28"/>
+        </w:rPr>
+        <w:t>4</w:t>
+      </w:r>
+      <w:r>
+        <w:rPr>
+          <w:rFonts w:eastAsia="Calibri"/>
+          <w:b/>
+          <w:bCs/>
+          <w:sz w:val="28"/>
+          <w:szCs w:val="28"/>
+        </w:rPr>
+        <w:t>.</w:t>
+      </w:r>
+      <w:r>
+        <w:rPr>
+          <w:rFonts w:eastAsia="Calibri"/>
+          <w:b/>
+          <w:bCs/>
+          <w:sz w:val="28"/>
+          <w:szCs w:val="28"/>
+        </w:rPr>
+        <w:t>2</w:t>
+      </w:r>
+      <w:r>
+        <w:rPr>
+          <w:rFonts w:eastAsia="Calibri"/>
+          <w:b/>
+          <w:bCs/>
+          <w:sz w:val="28"/>
+          <w:szCs w:val="28"/>
+        </w:rPr>
+        <w:t xml:space="preserve"> </w:t>
+      </w:r>
+      <w:r>
+        <w:rPr>
+          <w:rFonts w:eastAsia="Calibri"/>
+          <w:b/>
+          <w:bCs/>
+          <w:sz w:val="28"/>
+          <w:szCs w:val="28"/>
+        </w:rPr>
+        <w:t xml:space="preserve">Règles applicables </w:t>
+      </w:r>
+      <w:r>
+        <w:rPr>
+          <w:rFonts w:eastAsia="Calibri"/>
+          <w:b/>
+          <w:bCs/>
+          <w:sz w:val="28"/>
+          <w:szCs w:val="28"/>
+        </w:rPr>
+        <w:t>à la création d’une tirelire</w:t>
+      </w:r>
+      <w:bookmarkEnd w:id="69"/>
+      <w:bookmarkEnd w:id="70"/>
+    </w:p>
+    <w:tbl>
+      <w:tblPr>
+        <w:tblStyle w:val="Grilledutableau"/>
+        <w:tblW w:w="0" w:type="auto"/>
+        <w:tblLook w:val="04A0" w:firstRow="1" w:lastRow="0" w:firstColumn="1" w:lastColumn="0" w:noHBand="0" w:noVBand="1"/>
+      </w:tblPr>
+      <w:tblGrid>
+        <w:gridCol w:w="4814"/>
+        <w:gridCol w:w="4814"/>
+      </w:tblGrid>
+      <w:tr>
+        <w:tc>
+          <w:tcPr>
+            <w:tcW w:w="4814" w:type="dxa"/>
+          </w:tcPr>
+          <w:p>
+            <w:pPr>
+              <w:spacing w:line="360" w:lineRule="auto"/>
+              <w:jc w:val="center"/>
+              <w:rPr>
+                <w:b/>
+                <w:bCs/>
+                <w:sz w:val="28"/>
+                <w:szCs w:val="28"/>
+              </w:rPr>
+            </w:pPr>
+            <w:r>
+              <w:rPr>
+                <w:b/>
+                <w:bCs/>
+                <w:sz w:val="28"/>
+                <w:szCs w:val="28"/>
+              </w:rPr>
+              <w:t>Code</w:t>
+            </w:r>
+          </w:p>
+        </w:tc>
+        <w:tc>
+          <w:tcPr>
+            <w:tcW w:w="4814" w:type="dxa"/>
+          </w:tcPr>
+          <w:p>
+            <w:pPr>
+              <w:spacing w:line="360" w:lineRule="auto"/>
+              <w:jc w:val="center"/>
+              <w:rPr>
+                <w:b/>
+                <w:bCs/>
+                <w:sz w:val="28"/>
+                <w:szCs w:val="28"/>
+              </w:rPr>
+            </w:pPr>
+            <w:r>
+              <w:rPr>
+                <w:b/>
+                <w:bCs/>
+                <w:sz w:val="28"/>
+                <w:szCs w:val="28"/>
+              </w:rPr>
+              <w:t>Règle</w:t>
+            </w:r>
+          </w:p>
+        </w:tc>
+      </w:tr>
+      <w:tr>
+        <w:tc>
+          <w:tcPr>
+            <w:tcW w:w="4814" w:type="dxa"/>
+          </w:tcPr>
+          <w:p>
+            <w:pPr>
+              <w:spacing w:line="360" w:lineRule="auto"/>
+              <w:rPr>
+                <w:sz w:val="24"/>
+                <w:szCs w:val="24"/>
+              </w:rPr>
+            </w:pPr>
+            <w:r>
+              <w:rPr>
+                <w:sz w:val="24"/>
+                <w:szCs w:val="24"/>
+              </w:rPr>
+              <w:t>RG</w:t>
+            </w:r>
+            <w:r>
+              <w:rPr>
+                <w:sz w:val="24"/>
+                <w:szCs w:val="24"/>
+              </w:rPr>
+              <w:t>5</w:t>
+            </w:r>
+          </w:p>
+        </w:tc>
+        <w:tc>
+          <w:tcPr>
+            <w:tcW w:w="4814" w:type="dxa"/>
+          </w:tcPr>
+          <w:p>
+            <w:pPr>
+              <w:spacing w:line="360" w:lineRule="auto"/>
+              <w:rPr>
+                <w:sz w:val="24"/>
+                <w:szCs w:val="24"/>
+              </w:rPr>
+            </w:pPr>
+            <w:r>
+              <w:rPr>
+                <w:sz w:val="24"/>
+                <w:szCs w:val="24"/>
+              </w:rPr>
+              <w:t xml:space="preserve">Le montant </w:t>
+            </w:r>
+            <w:r>
+              <w:rPr>
+                <w:sz w:val="24"/>
+                <w:szCs w:val="24"/>
+              </w:rPr>
+              <w:t xml:space="preserve">objectif doit être </w:t>
+            </w:r>
+            <w:r>
+              <w:rPr>
+                <w:sz w:val="24"/>
+                <w:szCs w:val="24"/>
+              </w:rPr>
+              <w:t>strictement positif.</w:t>
+            </w:r>
+          </w:p>
+        </w:tc>
+      </w:tr>
+      <w:tr>
+        <w:tc>
+          <w:tcPr>
+            <w:tcW w:w="4814" w:type="dxa"/>
+          </w:tcPr>
+          <w:p>
+            <w:pPr>
+              <w:spacing w:line="360" w:lineRule="auto"/>
+              <w:rPr>
+                <w:sz w:val="24"/>
+                <w:szCs w:val="24"/>
+              </w:rPr>
+            </w:pPr>
+            <w:r>
+              <w:rPr>
+                <w:sz w:val="24"/>
+                <w:szCs w:val="24"/>
+              </w:rPr>
+              <w:t>RG</w:t>
+            </w:r>
+            <w:r>
+              <w:rPr>
+                <w:sz w:val="24"/>
+                <w:szCs w:val="24"/>
+              </w:rPr>
+              <w:t>6</w:t>
+            </w:r>
+          </w:p>
+        </w:tc>
+        <w:tc>
+          <w:tcPr>
+            <w:tcW w:w="4814" w:type="dxa"/>
+          </w:tcPr>
+          <w:p>
+            <w:pPr>
+              <w:spacing w:line="360" w:lineRule="auto"/>
+              <w:rPr>
+                <w:sz w:val="24"/>
+                <w:szCs w:val="24"/>
+              </w:rPr>
+            </w:pPr>
+            <w:r>
+              <w:rPr>
+                <w:sz w:val="24"/>
+                <w:szCs w:val="24"/>
+              </w:rPr>
+              <w:t>L</w:t>
+            </w:r>
+            <w:r>
+              <w:rPr>
+                <w:sz w:val="24"/>
+                <w:szCs w:val="24"/>
+              </w:rPr>
+              <w:t>a date d’échéance doit être postérieure à la date de création (dans le futur).</w:t>
+            </w:r>
+          </w:p>
+        </w:tc>
+      </w:tr>
+    </w:tbl>
     <w:p>
       <w:pPr>
         <w:pStyle w:val="Titre1"/>
@@ -2345,29 +2693,44 @@
         <w:rPr>
           <w:b/>
           <w:bCs/>
-        </w:rPr>
-      </w:pPr>
-      <w:bookmarkStart w:id="53" w:name="_Toc238460273"/>
-      <w:bookmarkStart w:id="54" w:name="_Toc238460616"/>
-      <w:bookmarkStart w:id="55" w:name="_Toc238460674"/>
-      <w:bookmarkStart w:id="56" w:name="_Toc239060554"/>
-      <w:bookmarkStart w:id="57" w:name="_Toc239060598"/>
-      <w:r>
+          <w:sz w:val="2"/>
+          <w:szCs w:val="2"/>
+        </w:rPr>
+      </w:pPr>
+      <w:bookmarkStart w:id="71" w:name="_Toc238460273"/>
+      <w:bookmarkStart w:id="72" w:name="_Toc238460616"/>
+      <w:bookmarkStart w:id="73" w:name="_Toc238460674"/>
+      <w:bookmarkStart w:id="74" w:name="_Toc239060554"/>
+      <w:bookmarkStart w:id="75" w:name="_Toc239060598"/>
+    </w:p>
+    <w:p>
+      <w:pPr>
+        <w:pStyle w:val="Titre1"/>
+        <w:spacing w:before="240" w:line="360" w:lineRule="auto"/>
+        <w:jc w:val="both"/>
         <w:rPr>
           <w:b/>
           <w:bCs/>
         </w:rPr>
-        <w:t>5.</w:t>
-      </w:r>
+      </w:pPr>
+      <w:bookmarkStart w:id="76" w:name="_Toc239152321"/>
+      <w:bookmarkStart w:id="77" w:name="_Toc239152428"/>
       <w:r>
         <w:rPr>
           <w:b/>
           <w:bCs/>
         </w:rPr>
+        <w:t>5.</w:t>
+      </w:r>
+      <w:r>
+        <w:rPr>
+          <w:b/>
+          <w:bCs/>
+        </w:rPr>
         <w:t xml:space="preserve"> </w:t>
       </w:r>
-      <w:bookmarkEnd w:id="51"/>
-      <w:bookmarkEnd w:id="52"/>
+      <w:bookmarkEnd w:id="67"/>
+      <w:bookmarkEnd w:id="68"/>
       <w:r>
         <w:rPr>
           <w:b/>
@@ -2377,11 +2740,13 @@
         </w:rPr>
         <w:t>Spécifications détaillées par cas d’utilisation</w:t>
       </w:r>
-      <w:bookmarkEnd w:id="53"/>
-      <w:bookmarkEnd w:id="54"/>
-      <w:bookmarkEnd w:id="55"/>
-      <w:bookmarkEnd w:id="56"/>
-      <w:bookmarkEnd w:id="57"/>
+      <w:bookmarkEnd w:id="71"/>
+      <w:bookmarkEnd w:id="72"/>
+      <w:bookmarkEnd w:id="73"/>
+      <w:bookmarkEnd w:id="74"/>
+      <w:bookmarkEnd w:id="75"/>
+      <w:bookmarkEnd w:id="76"/>
+      <w:bookmarkEnd w:id="77"/>
     </w:p>
     <w:p>
       <w:pPr>
@@ -2394,14 +2759,16 @@
           <w:szCs w:val="28"/>
         </w:rPr>
       </w:pPr>
-      <w:bookmarkStart w:id="58" w:name="_Toc238412453"/>
-      <w:bookmarkStart w:id="59" w:name="_Toc238413370"/>
-      <w:bookmarkStart w:id="60" w:name="_Toc238413443"/>
-      <w:bookmarkStart w:id="61" w:name="_Toc238460274"/>
-      <w:bookmarkStart w:id="62" w:name="_Toc238460617"/>
-      <w:bookmarkStart w:id="63" w:name="_Toc238460675"/>
-      <w:bookmarkStart w:id="64" w:name="_Toc239060555"/>
-      <w:bookmarkStart w:id="65" w:name="_Toc239060599"/>
+      <w:bookmarkStart w:id="78" w:name="_Toc238412453"/>
+      <w:bookmarkStart w:id="79" w:name="_Toc238413370"/>
+      <w:bookmarkStart w:id="80" w:name="_Toc238413443"/>
+      <w:bookmarkStart w:id="81" w:name="_Toc238460274"/>
+      <w:bookmarkStart w:id="82" w:name="_Toc238460617"/>
+      <w:bookmarkStart w:id="83" w:name="_Toc238460675"/>
+      <w:bookmarkStart w:id="84" w:name="_Toc239060555"/>
+      <w:bookmarkStart w:id="85" w:name="_Toc239060599"/>
+      <w:bookmarkStart w:id="86" w:name="_Toc239152322"/>
+      <w:bookmarkStart w:id="87" w:name="_Toc239152429"/>
       <w:r>
         <w:rPr>
           <w:rFonts w:eastAsia="Calibri"/>
@@ -2442,9 +2809,9 @@
         </w:rPr>
         <w:t xml:space="preserve"> </w:t>
       </w:r>
-      <w:bookmarkEnd w:id="58"/>
-      <w:bookmarkEnd w:id="59"/>
-      <w:bookmarkEnd w:id="60"/>
+      <w:bookmarkEnd w:id="78"/>
+      <w:bookmarkEnd w:id="79"/>
+      <w:bookmarkEnd w:id="80"/>
       <w:r>
         <w:rPr>
           <w:rFonts w:eastAsia="Calibri"/>
@@ -2455,11 +2822,13 @@
         </w:rPr>
         <w:t>UC1</w:t>
       </w:r>
-      <w:bookmarkEnd w:id="61"/>
-      <w:bookmarkEnd w:id="62"/>
-      <w:bookmarkEnd w:id="63"/>
-      <w:bookmarkEnd w:id="64"/>
-      <w:bookmarkEnd w:id="65"/>
+      <w:bookmarkEnd w:id="81"/>
+      <w:bookmarkEnd w:id="82"/>
+      <w:bookmarkEnd w:id="83"/>
+      <w:bookmarkEnd w:id="84"/>
+      <w:bookmarkEnd w:id="85"/>
+      <w:bookmarkEnd w:id="86"/>
+      <w:bookmarkEnd w:id="87"/>
     </w:p>
     <w:p>
       <w:pPr>
@@ -2696,6 +3065,7 @@
           <w:sz w:val="24"/>
           <w:szCs w:val="24"/>
         </w:rPr>
+        <w:lastRenderedPageBreak/>
         <w:t>Le système refuse la connexion et retourne un message d'erreur explicite, sans révéler si c'est le nom d'utilisateur ou le mot de passe qui est incorrect (par mesure de sécurité).</w:t>
       </w:r>
     </w:p>
@@ -2743,11 +3113,13 @@
           <w:szCs w:val="28"/>
         </w:rPr>
       </w:pPr>
-      <w:bookmarkStart w:id="66" w:name="_Toc238460275"/>
-      <w:bookmarkStart w:id="67" w:name="_Toc238460618"/>
-      <w:bookmarkStart w:id="68" w:name="_Toc238460676"/>
-      <w:bookmarkStart w:id="69" w:name="_Toc239060556"/>
-      <w:bookmarkStart w:id="70" w:name="_Toc239060600"/>
+      <w:bookmarkStart w:id="88" w:name="_Toc238460275"/>
+      <w:bookmarkStart w:id="89" w:name="_Toc238460618"/>
+      <w:bookmarkStart w:id="90" w:name="_Toc238460676"/>
+      <w:bookmarkStart w:id="91" w:name="_Toc239060556"/>
+      <w:bookmarkStart w:id="92" w:name="_Toc239060600"/>
+      <w:bookmarkStart w:id="93" w:name="_Toc239152323"/>
+      <w:bookmarkStart w:id="94" w:name="_Toc239152430"/>
       <w:r>
         <w:rPr>
           <w:rFonts w:eastAsia="Calibri"/>
@@ -2808,11 +3180,13 @@
         </w:rPr>
         <w:t>2</w:t>
       </w:r>
-      <w:bookmarkEnd w:id="66"/>
-      <w:bookmarkEnd w:id="67"/>
-      <w:bookmarkEnd w:id="68"/>
-      <w:bookmarkEnd w:id="69"/>
-      <w:bookmarkEnd w:id="70"/>
+      <w:bookmarkEnd w:id="88"/>
+      <w:bookmarkEnd w:id="89"/>
+      <w:bookmarkEnd w:id="90"/>
+      <w:bookmarkEnd w:id="91"/>
+      <w:bookmarkEnd w:id="92"/>
+      <w:bookmarkEnd w:id="93"/>
+      <w:bookmarkEnd w:id="94"/>
     </w:p>
     <w:p>
       <w:pPr>
@@ -2879,7 +3253,6 @@
           <w:sz w:val="28"/>
           <w:szCs w:val="28"/>
         </w:rPr>
-        <w:lastRenderedPageBreak/>
         <w:t xml:space="preserve">Préconditions </w:t>
       </w:r>
       <w:r>
@@ -3168,11 +3541,13 @@
           <w:szCs w:val="28"/>
         </w:rPr>
       </w:pPr>
-      <w:bookmarkStart w:id="71" w:name="_Toc238460276"/>
-      <w:bookmarkStart w:id="72" w:name="_Toc238460619"/>
-      <w:bookmarkStart w:id="73" w:name="_Toc238460677"/>
-      <w:bookmarkStart w:id="74" w:name="_Toc239060557"/>
-      <w:bookmarkStart w:id="75" w:name="_Toc239060601"/>
+      <w:bookmarkStart w:id="95" w:name="_Toc238460276"/>
+      <w:bookmarkStart w:id="96" w:name="_Toc238460619"/>
+      <w:bookmarkStart w:id="97" w:name="_Toc238460677"/>
+      <w:bookmarkStart w:id="98" w:name="_Toc239060557"/>
+      <w:bookmarkStart w:id="99" w:name="_Toc239060601"/>
+      <w:bookmarkStart w:id="100" w:name="_Toc239152324"/>
+      <w:bookmarkStart w:id="101" w:name="_Toc239152431"/>
       <w:r>
         <w:rPr>
           <w:rFonts w:eastAsia="Calibri"/>
@@ -3233,11 +3608,13 @@
         </w:rPr>
         <w:t>3</w:t>
       </w:r>
-      <w:bookmarkEnd w:id="71"/>
-      <w:bookmarkEnd w:id="72"/>
-      <w:bookmarkEnd w:id="73"/>
-      <w:bookmarkEnd w:id="74"/>
-      <w:bookmarkEnd w:id="75"/>
+      <w:bookmarkEnd w:id="95"/>
+      <w:bookmarkEnd w:id="96"/>
+      <w:bookmarkEnd w:id="97"/>
+      <w:bookmarkEnd w:id="98"/>
+      <w:bookmarkEnd w:id="99"/>
+      <w:bookmarkEnd w:id="100"/>
+      <w:bookmarkEnd w:id="101"/>
     </w:p>
     <w:p>
       <w:pPr>
@@ -3343,6 +3720,7 @@
           <w:sz w:val="28"/>
           <w:szCs w:val="28"/>
         </w:rPr>
+        <w:lastRenderedPageBreak/>
         <w:t>Scénario nominal :</w:t>
       </w:r>
     </w:p>
@@ -3473,6 +3851,11 @@
       <w:r>
         <w:t xml:space="preserve"> </w:t>
       </w:r>
+      <w:bookmarkStart w:id="102" w:name="_Toc238460277"/>
+      <w:bookmarkStart w:id="103" w:name="_Toc238460620"/>
+      <w:bookmarkStart w:id="104" w:name="_Toc238460678"/>
+      <w:bookmarkStart w:id="105" w:name="_Toc239060558"/>
+      <w:bookmarkStart w:id="106" w:name="_Toc239060602"/>
     </w:p>
     <w:p>
       <w:pPr>
@@ -3481,30 +3864,22 @@
         <w:ind w:firstLine="708"/>
         <w:jc w:val="both"/>
         <w:rPr>
+          <w:sz w:val="28"/>
+          <w:szCs w:val="28"/>
+        </w:rPr>
+      </w:pPr>
+      <w:bookmarkStart w:id="107" w:name="_Toc239152325"/>
+      <w:bookmarkStart w:id="108" w:name="_Toc239152432"/>
+      <w:r>
+        <w:rPr>
           <w:rFonts w:eastAsia="Calibri"/>
           <w:b/>
           <w:bCs/>
           <w:sz w:val="28"/>
           <w:szCs w:val="28"/>
         </w:rPr>
-      </w:pPr>
-      <w:bookmarkStart w:id="76" w:name="_Toc238460277"/>
-      <w:bookmarkStart w:id="77" w:name="_Toc238460620"/>
-      <w:bookmarkStart w:id="78" w:name="_Toc238460678"/>
-      <w:bookmarkStart w:id="79" w:name="_Toc239060558"/>
-      <w:bookmarkStart w:id="80" w:name="_Toc239060602"/>
-    </w:p>
-    <w:p>
-      <w:pPr>
-        <w:pStyle w:val="Titre2"/>
-        <w:spacing w:before="240" w:after="150" w:line="360" w:lineRule="auto"/>
-        <w:ind w:firstLine="708"/>
-        <w:jc w:val="both"/>
-        <w:rPr>
-          <w:sz w:val="28"/>
-          <w:szCs w:val="28"/>
-        </w:rPr>
-      </w:pPr>
+        <w:t>5</w:t>
+      </w:r>
       <w:r>
         <w:rPr>
           <w:rFonts w:eastAsia="Calibri"/>
@@ -3513,8 +3888,7 @@
           <w:sz w:val="28"/>
           <w:szCs w:val="28"/>
         </w:rPr>
-        <w:lastRenderedPageBreak/>
-        <w:t>5</w:t>
+        <w:t>.</w:t>
       </w:r>
       <w:r>
         <w:rPr>
@@ -3524,7 +3898,7 @@
           <w:sz w:val="28"/>
           <w:szCs w:val="28"/>
         </w:rPr>
-        <w:t>.</w:t>
+        <w:t>4</w:t>
       </w:r>
       <w:r>
         <w:rPr>
@@ -3534,7 +3908,7 @@
           <w:sz w:val="28"/>
           <w:szCs w:val="28"/>
         </w:rPr>
-        <w:t>4</w:t>
+        <w:t xml:space="preserve"> </w:t>
       </w:r>
       <w:r>
         <w:rPr>
@@ -3544,7 +3918,7 @@
           <w:sz w:val="28"/>
           <w:szCs w:val="28"/>
         </w:rPr>
-        <w:t xml:space="preserve"> </w:t>
+        <w:t>UC</w:t>
       </w:r>
       <w:r>
         <w:rPr>
@@ -3554,23 +3928,15 @@
           <w:sz w:val="28"/>
           <w:szCs w:val="28"/>
         </w:rPr>
-        <w:t>UC</w:t>
-      </w:r>
-      <w:r>
-        <w:rPr>
-          <w:rFonts w:eastAsia="Calibri"/>
-          <w:b/>
-          <w:bCs/>
-          <w:sz w:val="28"/>
-          <w:szCs w:val="28"/>
-        </w:rPr>
         <w:t>4</w:t>
       </w:r>
-      <w:bookmarkEnd w:id="76"/>
-      <w:bookmarkEnd w:id="77"/>
-      <w:bookmarkEnd w:id="78"/>
-      <w:bookmarkEnd w:id="79"/>
-      <w:bookmarkEnd w:id="80"/>
+      <w:bookmarkEnd w:id="102"/>
+      <w:bookmarkEnd w:id="103"/>
+      <w:bookmarkEnd w:id="104"/>
+      <w:bookmarkEnd w:id="105"/>
+      <w:bookmarkEnd w:id="106"/>
+      <w:bookmarkEnd w:id="107"/>
+      <w:bookmarkEnd w:id="108"/>
     </w:p>
     <w:p>
       <w:pPr>
@@ -3896,11 +4262,13 @@
           <w:szCs w:val="28"/>
         </w:rPr>
       </w:pPr>
-      <w:bookmarkStart w:id="81" w:name="_Toc238460278"/>
-      <w:bookmarkStart w:id="82" w:name="_Toc238460621"/>
-      <w:bookmarkStart w:id="83" w:name="_Toc238460679"/>
-      <w:bookmarkStart w:id="84" w:name="_Toc239060559"/>
-      <w:bookmarkStart w:id="85" w:name="_Toc239060603"/>
+      <w:bookmarkStart w:id="109" w:name="_Toc238460278"/>
+      <w:bookmarkStart w:id="110" w:name="_Toc238460621"/>
+      <w:bookmarkStart w:id="111" w:name="_Toc238460679"/>
+      <w:bookmarkStart w:id="112" w:name="_Toc239060559"/>
+      <w:bookmarkStart w:id="113" w:name="_Toc239060603"/>
+      <w:bookmarkStart w:id="114" w:name="_Toc239152326"/>
+      <w:bookmarkStart w:id="115" w:name="_Toc239152433"/>
       <w:r>
         <w:rPr>
           <w:rFonts w:eastAsia="Calibri"/>
@@ -3961,11 +4329,13 @@
         </w:rPr>
         <w:t>5</w:t>
       </w:r>
-      <w:bookmarkEnd w:id="81"/>
-      <w:bookmarkEnd w:id="82"/>
-      <w:bookmarkEnd w:id="83"/>
-      <w:bookmarkEnd w:id="84"/>
-      <w:bookmarkEnd w:id="85"/>
+      <w:bookmarkEnd w:id="109"/>
+      <w:bookmarkEnd w:id="110"/>
+      <w:bookmarkEnd w:id="111"/>
+      <w:bookmarkEnd w:id="112"/>
+      <w:bookmarkEnd w:id="113"/>
+      <w:bookmarkEnd w:id="114"/>
+      <w:bookmarkEnd w:id="115"/>
     </w:p>
     <w:p>
       <w:pPr>
@@ -4008,6 +4378,7 @@
           <w:sz w:val="28"/>
           <w:szCs w:val="28"/>
         </w:rPr>
+        <w:lastRenderedPageBreak/>
         <w:t xml:space="preserve">Acteur </w:t>
       </w:r>
       <w:r>
@@ -4166,7 +4537,6 @@
           <w:sz w:val="24"/>
           <w:szCs w:val="24"/>
         </w:rPr>
-        <w:lastRenderedPageBreak/>
         <w:t xml:space="preserve">Le système </w:t>
       </w:r>
       <w:r>
@@ -4371,11 +4741,13 @@
           <w:szCs w:val="28"/>
         </w:rPr>
       </w:pPr>
-      <w:bookmarkStart w:id="86" w:name="_Toc238460279"/>
-      <w:bookmarkStart w:id="87" w:name="_Toc238460622"/>
-      <w:bookmarkStart w:id="88" w:name="_Toc238460680"/>
-      <w:bookmarkStart w:id="89" w:name="_Toc239060560"/>
-      <w:bookmarkStart w:id="90" w:name="_Toc239060604"/>
+      <w:bookmarkStart w:id="116" w:name="_Toc238460279"/>
+      <w:bookmarkStart w:id="117" w:name="_Toc238460622"/>
+      <w:bookmarkStart w:id="118" w:name="_Toc238460680"/>
+      <w:bookmarkStart w:id="119" w:name="_Toc239060560"/>
+      <w:bookmarkStart w:id="120" w:name="_Toc239060604"/>
+      <w:bookmarkStart w:id="121" w:name="_Toc239152327"/>
+      <w:bookmarkStart w:id="122" w:name="_Toc239152434"/>
       <w:r>
         <w:rPr>
           <w:rFonts w:eastAsia="Calibri"/>
@@ -4436,11 +4808,13 @@
         </w:rPr>
         <w:t>6</w:t>
       </w:r>
-      <w:bookmarkEnd w:id="86"/>
-      <w:bookmarkEnd w:id="87"/>
-      <w:bookmarkEnd w:id="88"/>
-      <w:bookmarkEnd w:id="89"/>
-      <w:bookmarkEnd w:id="90"/>
+      <w:bookmarkEnd w:id="116"/>
+      <w:bookmarkEnd w:id="117"/>
+      <w:bookmarkEnd w:id="118"/>
+      <w:bookmarkEnd w:id="119"/>
+      <w:bookmarkEnd w:id="120"/>
+      <w:bookmarkEnd w:id="121"/>
+      <w:bookmarkEnd w:id="122"/>
     </w:p>
     <w:p>
       <w:pPr>
@@ -4686,6 +5060,7 @@
           <w:sz w:val="24"/>
           <w:szCs w:val="24"/>
         </w:rPr>
+        <w:lastRenderedPageBreak/>
         <w:t>Le système vérifie que l’objectif est atteint ou que l’échéance est dépassée.</w:t>
       </w:r>
     </w:p>
@@ -4864,7 +5239,6 @@
           <w:sz w:val="24"/>
           <w:szCs w:val="24"/>
         </w:rPr>
-        <w:lastRenderedPageBreak/>
         <w:t>Objectif non atteint et échéance non arrivée : refus du retrait.</w:t>
       </w:r>
     </w:p>
@@ -4989,11 +5363,13 @@
           <w:szCs w:val="28"/>
         </w:rPr>
       </w:pPr>
-      <w:bookmarkStart w:id="91" w:name="_Toc238460280"/>
-      <w:bookmarkStart w:id="92" w:name="_Toc238460623"/>
-      <w:bookmarkStart w:id="93" w:name="_Toc238460681"/>
-      <w:bookmarkStart w:id="94" w:name="_Toc239060561"/>
-      <w:bookmarkStart w:id="95" w:name="_Toc239060605"/>
+      <w:bookmarkStart w:id="123" w:name="_Toc238460280"/>
+      <w:bookmarkStart w:id="124" w:name="_Toc238460623"/>
+      <w:bookmarkStart w:id="125" w:name="_Toc238460681"/>
+      <w:bookmarkStart w:id="126" w:name="_Toc239060561"/>
+      <w:bookmarkStart w:id="127" w:name="_Toc239060605"/>
+      <w:bookmarkStart w:id="128" w:name="_Toc239152328"/>
+      <w:bookmarkStart w:id="129" w:name="_Toc239152435"/>
       <w:r>
         <w:rPr>
           <w:rFonts w:eastAsia="Calibri"/>
@@ -5054,11 +5430,13 @@
         </w:rPr>
         <w:t>7</w:t>
       </w:r>
-      <w:bookmarkEnd w:id="91"/>
-      <w:bookmarkEnd w:id="92"/>
-      <w:bookmarkEnd w:id="93"/>
-      <w:bookmarkEnd w:id="94"/>
-      <w:bookmarkEnd w:id="95"/>
+      <w:bookmarkEnd w:id="123"/>
+      <w:bookmarkEnd w:id="124"/>
+      <w:bookmarkEnd w:id="125"/>
+      <w:bookmarkEnd w:id="126"/>
+      <w:bookmarkEnd w:id="127"/>
+      <w:bookmarkEnd w:id="128"/>
+      <w:bookmarkEnd w:id="129"/>
     </w:p>
     <w:p>
       <w:pPr>
@@ -5363,6 +5741,7 @@
           <w:sz w:val="28"/>
           <w:szCs w:val="28"/>
         </w:rPr>
+        <w:lastRenderedPageBreak/>
         <w:t xml:space="preserve">Règles de gestion appliquées </w:t>
       </w:r>
       <w:r>
@@ -5393,13 +5772,15 @@
           <w:szCs w:val="30"/>
         </w:rPr>
       </w:pPr>
-      <w:bookmarkStart w:id="96" w:name="_Toc238413372"/>
-      <w:bookmarkStart w:id="97" w:name="_Toc238413445"/>
-      <w:bookmarkStart w:id="98" w:name="_Toc238460281"/>
-      <w:bookmarkStart w:id="99" w:name="_Toc238460624"/>
-      <w:bookmarkStart w:id="100" w:name="_Toc238460682"/>
-      <w:bookmarkStart w:id="101" w:name="_Toc239060562"/>
-      <w:bookmarkStart w:id="102" w:name="_Toc239060606"/>
+      <w:bookmarkStart w:id="130" w:name="_Toc238413372"/>
+      <w:bookmarkStart w:id="131" w:name="_Toc238413445"/>
+      <w:bookmarkStart w:id="132" w:name="_Toc238460281"/>
+      <w:bookmarkStart w:id="133" w:name="_Toc238460624"/>
+      <w:bookmarkStart w:id="134" w:name="_Toc238460682"/>
+      <w:bookmarkStart w:id="135" w:name="_Toc239060562"/>
+      <w:bookmarkStart w:id="136" w:name="_Toc239060606"/>
+      <w:bookmarkStart w:id="137" w:name="_Toc239152329"/>
+      <w:bookmarkStart w:id="138" w:name="_Toc239152436"/>
       <w:r>
         <w:rPr>
           <w:b/>
@@ -5418,8 +5799,8 @@
         </w:rPr>
         <w:t xml:space="preserve">. </w:t>
       </w:r>
-      <w:bookmarkEnd w:id="96"/>
-      <w:bookmarkEnd w:id="97"/>
+      <w:bookmarkEnd w:id="130"/>
+      <w:bookmarkEnd w:id="131"/>
       <w:r>
         <w:rPr>
           <w:b/>
@@ -5429,11 +5810,13 @@
         </w:rPr>
         <w:t>Exigences non fonctionnelles</w:t>
       </w:r>
-      <w:bookmarkEnd w:id="98"/>
-      <w:bookmarkEnd w:id="99"/>
-      <w:bookmarkEnd w:id="100"/>
-      <w:bookmarkEnd w:id="101"/>
-      <w:bookmarkEnd w:id="102"/>
+      <w:bookmarkEnd w:id="132"/>
+      <w:bookmarkEnd w:id="133"/>
+      <w:bookmarkEnd w:id="134"/>
+      <w:bookmarkEnd w:id="135"/>
+      <w:bookmarkEnd w:id="136"/>
+      <w:bookmarkEnd w:id="137"/>
+      <w:bookmarkEnd w:id="138"/>
     </w:p>
     <w:tbl>
       <w:tblPr>
@@ -5561,7 +5944,6 @@
                 <w:sz w:val="24"/>
                 <w:szCs w:val="24"/>
               </w:rPr>
-              <w:lastRenderedPageBreak/>
               <w:t>Clarté des erreurs</w:t>
             </w:r>
           </w:p>
@@ -5898,118 +6280,6 @@
     </w:p>
     <w:p>
       <w:pPr>
-        <w:tabs>
-          <w:tab w:val="left" w:pos="1248"/>
-        </w:tabs>
-      </w:pPr>
-    </w:p>
-    <w:p>
-      <w:pPr>
-        <w:tabs>
-          <w:tab w:val="left" w:pos="1248"/>
-        </w:tabs>
-      </w:pPr>
-    </w:p>
-    <w:p>
-      <w:pPr>
-        <w:tabs>
-          <w:tab w:val="left" w:pos="1248"/>
-        </w:tabs>
-      </w:pPr>
-    </w:p>
-    <w:p>
-      <w:pPr>
-        <w:tabs>
-          <w:tab w:val="left" w:pos="1248"/>
-        </w:tabs>
-      </w:pPr>
-    </w:p>
-    <w:p>
-      <w:pPr>
-        <w:tabs>
-          <w:tab w:val="left" w:pos="1248"/>
-        </w:tabs>
-      </w:pPr>
-    </w:p>
-    <w:p>
-      <w:pPr>
-        <w:tabs>
-          <w:tab w:val="left" w:pos="1248"/>
-        </w:tabs>
-      </w:pPr>
-    </w:p>
-    <w:p>
-      <w:pPr>
-        <w:tabs>
-          <w:tab w:val="left" w:pos="1248"/>
-        </w:tabs>
-      </w:pPr>
-    </w:p>
-    <w:p>
-      <w:pPr>
-        <w:tabs>
-          <w:tab w:val="left" w:pos="1248"/>
-        </w:tabs>
-      </w:pPr>
-    </w:p>
-    <w:p>
-      <w:pPr>
-        <w:tabs>
-          <w:tab w:val="left" w:pos="1248"/>
-        </w:tabs>
-      </w:pPr>
-    </w:p>
-    <w:p>
-      <w:pPr>
-        <w:tabs>
-          <w:tab w:val="left" w:pos="1248"/>
-        </w:tabs>
-      </w:pPr>
-    </w:p>
-    <w:p>
-      <w:pPr>
-        <w:tabs>
-          <w:tab w:val="left" w:pos="1248"/>
-        </w:tabs>
-      </w:pPr>
-    </w:p>
-    <w:p>
-      <w:pPr>
-        <w:tabs>
-          <w:tab w:val="left" w:pos="1248"/>
-        </w:tabs>
-      </w:pPr>
-    </w:p>
-    <w:p>
-      <w:pPr>
-        <w:tabs>
-          <w:tab w:val="left" w:pos="1248"/>
-        </w:tabs>
-      </w:pPr>
-    </w:p>
-    <w:p>
-      <w:pPr>
-        <w:tabs>
-          <w:tab w:val="left" w:pos="1248"/>
-        </w:tabs>
-      </w:pPr>
-    </w:p>
-    <w:p>
-      <w:pPr>
-        <w:tabs>
-          <w:tab w:val="left" w:pos="1248"/>
-        </w:tabs>
-      </w:pPr>
-    </w:p>
-    <w:p>
-      <w:pPr>
-        <w:tabs>
-          <w:tab w:val="left" w:pos="1248"/>
-        </w:tabs>
-      </w:pPr>
-    </w:p>
-    <w:p>
-      <w:pPr>
         <w:pStyle w:val="Titre1"/>
         <w:spacing w:before="400" w:after="200" w:line="360" w:lineRule="auto"/>
         <w:jc w:val="both"/>
@@ -6021,13 +6291,15 @@
           <w:szCs w:val="30"/>
         </w:rPr>
       </w:pPr>
-      <w:bookmarkStart w:id="103" w:name="_Toc238413380"/>
-      <w:bookmarkStart w:id="104" w:name="_Toc238413453"/>
-      <w:bookmarkStart w:id="105" w:name="_Toc238460282"/>
-      <w:bookmarkStart w:id="106" w:name="_Toc238460625"/>
-      <w:bookmarkStart w:id="107" w:name="_Toc238460683"/>
-      <w:bookmarkStart w:id="108" w:name="_Toc239060563"/>
-      <w:bookmarkStart w:id="109" w:name="_Toc239060607"/>
+      <w:bookmarkStart w:id="139" w:name="_Toc238413380"/>
+      <w:bookmarkStart w:id="140" w:name="_Toc238413453"/>
+      <w:bookmarkStart w:id="141" w:name="_Toc238460282"/>
+      <w:bookmarkStart w:id="142" w:name="_Toc238460625"/>
+      <w:bookmarkStart w:id="143" w:name="_Toc238460683"/>
+      <w:bookmarkStart w:id="144" w:name="_Toc239060563"/>
+      <w:bookmarkStart w:id="145" w:name="_Toc239060607"/>
+      <w:bookmarkStart w:id="146" w:name="_Toc239152330"/>
+      <w:bookmarkStart w:id="147" w:name="_Toc239152437"/>
       <w:r>
         <w:rPr>
           <w:rFonts w:eastAsia="Calibri"/>
@@ -6036,15 +6308,18 @@
           <w:sz w:val="30"/>
           <w:szCs w:val="30"/>
         </w:rPr>
+        <w:lastRenderedPageBreak/>
         <w:t>Table des matières</w:t>
       </w:r>
-      <w:bookmarkEnd w:id="103"/>
-      <w:bookmarkEnd w:id="104"/>
-      <w:bookmarkEnd w:id="105"/>
-      <w:bookmarkEnd w:id="106"/>
-      <w:bookmarkEnd w:id="107"/>
-      <w:bookmarkEnd w:id="108"/>
-      <w:bookmarkEnd w:id="109"/>
+      <w:bookmarkEnd w:id="139"/>
+      <w:bookmarkEnd w:id="140"/>
+      <w:bookmarkEnd w:id="141"/>
+      <w:bookmarkEnd w:id="142"/>
+      <w:bookmarkEnd w:id="143"/>
+      <w:bookmarkEnd w:id="144"/>
+      <w:bookmarkEnd w:id="145"/>
+      <w:bookmarkEnd w:id="146"/>
+      <w:bookmarkEnd w:id="147"/>
     </w:p>
     <w:p>
       <w:pPr>
@@ -6081,7 +6356,7 @@
         </w:rPr>
         <w:fldChar w:fldCharType="separate"/>
       </w:r>
-      <w:hyperlink w:anchor="_Toc239060547" w:history="1">
+      <w:hyperlink w:anchor="_Toc239152312" w:history="1">
         <w:r>
           <w:rPr>
             <w:rStyle w:val="Lienhypertexte"/>
@@ -6119,7 +6394,7 @@
             <w:sz w:val="24"/>
             <w:szCs w:val="24"/>
           </w:rPr>
-          <w:instrText xml:space="preserve"> PAGEREF _Toc239060547 \h </w:instrText>
+          <w:instrText xml:space="preserve"> PAGEREF _Toc239152312 \h </w:instrText>
         </w:r>
         <w:r>
           <w:rPr>
@@ -6172,7 +6447,7 @@
           <w:szCs w:val="24"/>
         </w:rPr>
       </w:pPr>
-      <w:hyperlink w:anchor="_Toc239060548" w:history="1">
+      <w:hyperlink w:anchor="_Toc239152313" w:history="1">
         <w:r>
           <w:rPr>
             <w:rStyle w:val="Lienhypertexte"/>
@@ -6210,7 +6485,7 @@
             <w:sz w:val="24"/>
             <w:szCs w:val="24"/>
           </w:rPr>
-          <w:instrText xml:space="preserve"> PAGEREF _Toc239060548 \h </w:instrText>
+          <w:instrText xml:space="preserve"> PAGEREF _Toc239152313 \h </w:instrText>
         </w:r>
         <w:r>
           <w:rPr>
@@ -6263,7 +6538,7 @@
           <w:szCs w:val="24"/>
         </w:rPr>
       </w:pPr>
-      <w:hyperlink w:anchor="_Toc239060549" w:history="1">
+      <w:hyperlink w:anchor="_Toc239152314" w:history="1">
         <w:r>
           <w:rPr>
             <w:rStyle w:val="Lienhypertexte"/>
@@ -6301,7 +6576,7 @@
             <w:sz w:val="24"/>
             <w:szCs w:val="24"/>
           </w:rPr>
-          <w:instrText xml:space="preserve"> PAGEREF _Toc239060549 \h </w:instrText>
+          <w:instrText xml:space="preserve"> PAGEREF _Toc239152314 \h </w:instrText>
         </w:r>
         <w:r>
           <w:rPr>
@@ -6354,7 +6629,7 @@
           <w:szCs w:val="24"/>
         </w:rPr>
       </w:pPr>
-      <w:hyperlink w:anchor="_Toc239060550" w:history="1">
+      <w:hyperlink w:anchor="_Toc239152315" w:history="1">
         <w:r>
           <w:rPr>
             <w:rStyle w:val="Lienhypertexte"/>
@@ -6392,7 +6667,7 @@
             <w:sz w:val="24"/>
             <w:szCs w:val="24"/>
           </w:rPr>
-          <w:instrText xml:space="preserve"> PAGEREF _Toc239060550 \h </w:instrText>
+          <w:instrText xml:space="preserve"> PAGEREF _Toc239152315 \h </w:instrText>
         </w:r>
         <w:r>
           <w:rPr>
@@ -6445,7 +6720,7 @@
           <w:szCs w:val="24"/>
         </w:rPr>
       </w:pPr>
-      <w:hyperlink w:anchor="_Toc239060551" w:history="1">
+      <w:hyperlink w:anchor="_Toc239152316" w:history="1">
         <w:r>
           <w:rPr>
             <w:rStyle w:val="Lienhypertexte"/>
@@ -6483,7 +6758,7 @@
             <w:sz w:val="24"/>
             <w:szCs w:val="24"/>
           </w:rPr>
-          <w:instrText xml:space="preserve"> PAGEREF _Toc239060551 \h </w:instrText>
+          <w:instrText xml:space="preserve"> PAGEREF _Toc239152316 \h </w:instrText>
         </w:r>
         <w:r>
           <w:rPr>
@@ -6536,7 +6811,7 @@
           <w:szCs w:val="24"/>
         </w:rPr>
       </w:pPr>
-      <w:hyperlink w:anchor="_Toc239060552" w:history="1">
+      <w:hyperlink w:anchor="_Toc239152317" w:history="1">
         <w:r>
           <w:rPr>
             <w:rStyle w:val="Lienhypertexte"/>
@@ -6574,7 +6849,7 @@
             <w:sz w:val="24"/>
             <w:szCs w:val="24"/>
           </w:rPr>
-          <w:instrText xml:space="preserve"> PAGEREF _Toc239060552 \h </w:instrText>
+          <w:instrText xml:space="preserve"> PAGEREF _Toc239152317 \h </w:instrText>
         </w:r>
         <w:r>
           <w:rPr>
@@ -6627,7 +6902,7 @@
           <w:szCs w:val="24"/>
         </w:rPr>
       </w:pPr>
-      <w:hyperlink w:anchor="_Toc239060553" w:history="1">
+      <w:hyperlink w:anchor="_Toc239152318" w:history="1">
         <w:r>
           <w:rPr>
             <w:rStyle w:val="Lienhypertexte"/>
@@ -6665,7 +6940,7 @@
             <w:sz w:val="24"/>
             <w:szCs w:val="24"/>
           </w:rPr>
-          <w:instrText xml:space="preserve"> PAGEREF _Toc239060553 \h </w:instrText>
+          <w:instrText xml:space="preserve"> PAGEREF _Toc239152318 \h </w:instrText>
         </w:r>
         <w:r>
           <w:rPr>
@@ -6706,7 +6981,7 @@
     </w:p>
     <w:p>
       <w:pPr>
-        <w:pStyle w:val="TM1"/>
+        <w:pStyle w:val="TM2"/>
         <w:tabs>
           <w:tab w:val="right" w:leader="dot" w:pos="9628"/>
         </w:tabs>
@@ -6718,97 +6993,7 @@
           <w:szCs w:val="24"/>
         </w:rPr>
       </w:pPr>
-      <w:hyperlink w:anchor="_Toc239060554" w:history="1">
-        <w:r>
-          <w:rPr>
-            <w:rStyle w:val="Lienhypertexte"/>
-            <w:b/>
-            <w:bCs/>
-            <w:noProof/>
-            <w:sz w:val="24"/>
-            <w:szCs w:val="24"/>
-          </w:rPr>
-          <w:t>5. Spécifications détaillées par cas d’utilisation</w:t>
-        </w:r>
-        <w:r>
-          <w:rPr>
-            <w:noProof/>
-            <w:webHidden/>
-            <w:sz w:val="24"/>
-            <w:szCs w:val="24"/>
-          </w:rPr>
-          <w:tab/>
-        </w:r>
-        <w:r>
-          <w:rPr>
-            <w:noProof/>
-            <w:webHidden/>
-            <w:sz w:val="24"/>
-            <w:szCs w:val="24"/>
-          </w:rPr>
-          <w:fldChar w:fldCharType="begin"/>
-        </w:r>
-        <w:r>
-          <w:rPr>
-            <w:noProof/>
-            <w:webHidden/>
-            <w:sz w:val="24"/>
-            <w:szCs w:val="24"/>
-          </w:rPr>
-          <w:instrText xml:space="preserve"> PAGEREF _Toc239060554 \h </w:instrText>
-        </w:r>
-        <w:r>
-          <w:rPr>
-            <w:noProof/>
-            <w:webHidden/>
-            <w:sz w:val="24"/>
-            <w:szCs w:val="24"/>
-          </w:rPr>
-        </w:r>
-        <w:r>
-          <w:rPr>
-            <w:noProof/>
-            <w:webHidden/>
-            <w:sz w:val="24"/>
-            <w:szCs w:val="24"/>
-          </w:rPr>
-          <w:fldChar w:fldCharType="separate"/>
-        </w:r>
-        <w:r>
-          <w:rPr>
-            <w:noProof/>
-            <w:webHidden/>
-            <w:sz w:val="24"/>
-            <w:szCs w:val="24"/>
-          </w:rPr>
-          <w:t>5</w:t>
-        </w:r>
-        <w:r>
-          <w:rPr>
-            <w:noProof/>
-            <w:webHidden/>
-            <w:sz w:val="24"/>
-            <w:szCs w:val="24"/>
-          </w:rPr>
-          <w:fldChar w:fldCharType="end"/>
-        </w:r>
-      </w:hyperlink>
-    </w:p>
-    <w:p>
-      <w:pPr>
-        <w:pStyle w:val="TM2"/>
-        <w:tabs>
-          <w:tab w:val="right" w:leader="dot" w:pos="9628"/>
-        </w:tabs>
-        <w:spacing w:line="360" w:lineRule="auto"/>
-        <w:rPr>
-          <w:rFonts w:asciiTheme="minorHAnsi" w:eastAsiaTheme="minorEastAsia" w:hAnsiTheme="minorHAnsi" w:cstheme="minorBidi"/>
-          <w:noProof/>
-          <w:sz w:val="24"/>
-          <w:szCs w:val="24"/>
-        </w:rPr>
-      </w:pPr>
-      <w:hyperlink w:anchor="_Toc239060555" w:history="1">
+      <w:hyperlink w:anchor="_Toc239152319" w:history="1">
         <w:r>
           <w:rPr>
             <w:rStyle w:val="Lienhypertexte"/>
@@ -6819,7 +7004,7 @@
             <w:sz w:val="24"/>
             <w:szCs w:val="24"/>
           </w:rPr>
-          <w:t>5.1 UC1</w:t>
+          <w:t>4.1 Règles applicables aux opérations (dépôt et retrait)</w:t>
         </w:r>
         <w:r>
           <w:rPr>
@@ -6846,7 +7031,7 @@
             <w:sz w:val="24"/>
             <w:szCs w:val="24"/>
           </w:rPr>
-          <w:instrText xml:space="preserve"> PAGEREF _Toc239060555 \h </w:instrText>
+          <w:instrText xml:space="preserve"> PAGEREF _Toc239152319 \h </w:instrText>
         </w:r>
         <w:r>
           <w:rPr>
@@ -6872,7 +7057,7 @@
             <w:sz w:val="24"/>
             <w:szCs w:val="24"/>
           </w:rPr>
-          <w:t>5</w:t>
+          <w:t>4</w:t>
         </w:r>
         <w:r>
           <w:rPr>
@@ -6899,7 +7084,7 @@
           <w:szCs w:val="24"/>
         </w:rPr>
       </w:pPr>
-      <w:hyperlink w:anchor="_Toc239060556" w:history="1">
+      <w:hyperlink w:anchor="_Toc239152320" w:history="1">
         <w:r>
           <w:rPr>
             <w:rStyle w:val="Lienhypertexte"/>
@@ -6910,7 +7095,7 @@
             <w:sz w:val="24"/>
             <w:szCs w:val="24"/>
           </w:rPr>
-          <w:t>5.2 UC2</w:t>
+          <w:t>4.2 Règles applicables à la création d’une tirelire</w:t>
         </w:r>
         <w:r>
           <w:rPr>
@@ -6937,7 +7122,7 @@
             <w:sz w:val="24"/>
             <w:szCs w:val="24"/>
           </w:rPr>
-          <w:instrText xml:space="preserve"> PAGEREF _Toc239060556 \h </w:instrText>
+          <w:instrText xml:space="preserve"> PAGEREF _Toc239152320 \h </w:instrText>
         </w:r>
         <w:r>
           <w:rPr>
@@ -6978,7 +7163,7 @@
     </w:p>
     <w:p>
       <w:pPr>
-        <w:pStyle w:val="TM2"/>
+        <w:pStyle w:val="TM1"/>
         <w:tabs>
           <w:tab w:val="right" w:leader="dot" w:pos="9628"/>
         </w:tabs>
@@ -6990,7 +7175,97 @@
           <w:szCs w:val="24"/>
         </w:rPr>
       </w:pPr>
-      <w:hyperlink w:anchor="_Toc239060557" w:history="1">
+      <w:hyperlink w:anchor="_Toc239152321" w:history="1">
+        <w:r>
+          <w:rPr>
+            <w:rStyle w:val="Lienhypertexte"/>
+            <w:b/>
+            <w:bCs/>
+            <w:noProof/>
+            <w:sz w:val="24"/>
+            <w:szCs w:val="24"/>
+          </w:rPr>
+          <w:t>5. Spécifications détaillées par cas d’utilisation</w:t>
+        </w:r>
+        <w:r>
+          <w:rPr>
+            <w:noProof/>
+            <w:webHidden/>
+            <w:sz w:val="24"/>
+            <w:szCs w:val="24"/>
+          </w:rPr>
+          <w:tab/>
+        </w:r>
+        <w:r>
+          <w:rPr>
+            <w:noProof/>
+            <w:webHidden/>
+            <w:sz w:val="24"/>
+            <w:szCs w:val="24"/>
+          </w:rPr>
+          <w:fldChar w:fldCharType="begin"/>
+        </w:r>
+        <w:r>
+          <w:rPr>
+            <w:noProof/>
+            <w:webHidden/>
+            <w:sz w:val="24"/>
+            <w:szCs w:val="24"/>
+          </w:rPr>
+          <w:instrText xml:space="preserve"> PAGEREF _Toc239152321 \h </w:instrText>
+        </w:r>
+        <w:r>
+          <w:rPr>
+            <w:noProof/>
+            <w:webHidden/>
+            <w:sz w:val="24"/>
+            <w:szCs w:val="24"/>
+          </w:rPr>
+        </w:r>
+        <w:r>
+          <w:rPr>
+            <w:noProof/>
+            <w:webHidden/>
+            <w:sz w:val="24"/>
+            <w:szCs w:val="24"/>
+          </w:rPr>
+          <w:fldChar w:fldCharType="separate"/>
+        </w:r>
+        <w:r>
+          <w:rPr>
+            <w:noProof/>
+            <w:webHidden/>
+            <w:sz w:val="24"/>
+            <w:szCs w:val="24"/>
+          </w:rPr>
+          <w:t>5</w:t>
+        </w:r>
+        <w:r>
+          <w:rPr>
+            <w:noProof/>
+            <w:webHidden/>
+            <w:sz w:val="24"/>
+            <w:szCs w:val="24"/>
+          </w:rPr>
+          <w:fldChar w:fldCharType="end"/>
+        </w:r>
+      </w:hyperlink>
+    </w:p>
+    <w:p>
+      <w:pPr>
+        <w:pStyle w:val="TM2"/>
+        <w:tabs>
+          <w:tab w:val="right" w:leader="dot" w:pos="9628"/>
+        </w:tabs>
+        <w:spacing w:line="360" w:lineRule="auto"/>
+        <w:rPr>
+          <w:rFonts w:asciiTheme="minorHAnsi" w:eastAsiaTheme="minorEastAsia" w:hAnsiTheme="minorHAnsi" w:cstheme="minorBidi"/>
+          <w:noProof/>
+          <w:sz w:val="24"/>
+          <w:szCs w:val="24"/>
+        </w:rPr>
+      </w:pPr>
+      <w:hyperlink w:anchor="_Toc239152322" w:history="1">
         <w:r>
           <w:rPr>
             <w:rStyle w:val="Lienhypertexte"/>
@@ -7001,7 +7276,7 @@
             <w:sz w:val="24"/>
             <w:szCs w:val="24"/>
           </w:rPr>
-          <w:t>5.3 UC3</w:t>
+          <w:t>5.1 UC1</w:t>
         </w:r>
         <w:r>
           <w:rPr>
@@ -7028,7 +7303,7 @@
             <w:sz w:val="24"/>
             <w:szCs w:val="24"/>
           </w:rPr>
-          <w:instrText xml:space="preserve"> PAGEREF _Toc239060557 \h </w:instrText>
+          <w:instrText xml:space="preserve"> PAGEREF _Toc239152322 \h </w:instrText>
         </w:r>
         <w:r>
           <w:rPr>
@@ -7054,7 +7329,7 @@
             <w:sz w:val="24"/>
             <w:szCs w:val="24"/>
           </w:rPr>
-          <w:t>6</w:t>
+          <w:t>5</w:t>
         </w:r>
         <w:r>
           <w:rPr>
@@ -7081,7 +7356,7 @@
           <w:szCs w:val="24"/>
         </w:rPr>
       </w:pPr>
-      <w:hyperlink w:anchor="_Toc239060558" w:history="1">
+      <w:hyperlink w:anchor="_Toc239152323" w:history="1">
         <w:r>
           <w:rPr>
             <w:rStyle w:val="Lienhypertexte"/>
@@ -7092,87 +7367,8 @@
             <w:sz w:val="24"/>
             <w:szCs w:val="24"/>
           </w:rPr>
-          <w:t>5.4 UC4</w:t>
-        </w:r>
-        <w:r>
-          <w:rPr>
-            <w:noProof/>
-            <w:webHidden/>
-            <w:sz w:val="24"/>
-            <w:szCs w:val="24"/>
-          </w:rPr>
-          <w:tab/>
-        </w:r>
-        <w:r>
-          <w:rPr>
-            <w:noProof/>
-            <w:webHidden/>
-            <w:sz w:val="24"/>
-            <w:szCs w:val="24"/>
-          </w:rPr>
-          <w:fldChar w:fldCharType="begin"/>
-        </w:r>
-        <w:r>
-          <w:rPr>
-            <w:noProof/>
-            <w:webHidden/>
-            <w:sz w:val="24"/>
-            <w:szCs w:val="24"/>
-          </w:rPr>
-          <w:instrText xml:space="preserve"> PAGEREF _Toc239060558 \h </w:instrText>
-        </w:r>
-        <w:r>
-          <w:rPr>
-            <w:noProof/>
-            <w:webHidden/>
-            <w:sz w:val="24"/>
-            <w:szCs w:val="24"/>
-          </w:rPr>
-        </w:r>
-        <w:r>
-          <w:rPr>
-            <w:noProof/>
-            <w:webHidden/>
-            <w:sz w:val="24"/>
-            <w:szCs w:val="24"/>
-          </w:rPr>
-          <w:fldChar w:fldCharType="separate"/>
-        </w:r>
-        <w:r>
-          <w:rPr>
-            <w:noProof/>
-            <w:webHidden/>
-            <w:sz w:val="24"/>
-            <w:szCs w:val="24"/>
-          </w:rPr>
-          <w:t>7</w:t>
-        </w:r>
-        <w:r>
-          <w:rPr>
-            <w:noProof/>
-            <w:webHidden/>
-            <w:sz w:val="24"/>
-            <w:szCs w:val="24"/>
-          </w:rPr>
-          <w:fldChar w:fldCharType="end"/>
-        </w:r>
-      </w:hyperlink>
-    </w:p>
-    <w:p>
-      <w:pPr>
-        <w:pStyle w:val="TM2"/>
-        <w:tabs>
-          <w:tab w:val="right" w:leader="dot" w:pos="9628"/>
-        </w:tabs>
-        <w:spacing w:line="360" w:lineRule="auto"/>
-        <w:rPr>
-          <w:rFonts w:asciiTheme="minorHAnsi" w:eastAsiaTheme="minorEastAsia" w:hAnsiTheme="minorHAnsi" w:cstheme="minorBidi"/>
-          <w:noProof/>
-          <w:sz w:val="24"/>
-          <w:szCs w:val="24"/>
-        </w:rPr>
-      </w:pPr>
-      <w:hyperlink w:anchor="_Toc239060559" w:history="1">
+          <w:t>5.2 UC</w:t>
+        </w:r>
         <w:r>
           <w:rPr>
             <w:rStyle w:val="Lienhypertexte"/>
@@ -7183,7 +7379,7 @@
             <w:sz w:val="24"/>
             <w:szCs w:val="24"/>
           </w:rPr>
-          <w:t>5.5 UC5</w:t>
+          <w:t>2</w:t>
         </w:r>
         <w:r>
           <w:rPr>
@@ -7210,7 +7406,7 @@
             <w:sz w:val="24"/>
             <w:szCs w:val="24"/>
           </w:rPr>
-          <w:instrText xml:space="preserve"> PAGEREF _Toc239060559 \h </w:instrText>
+          <w:instrText xml:space="preserve"> PAGEREF _Toc239152323 \h </w:instrText>
         </w:r>
         <w:r>
           <w:rPr>
@@ -7236,7 +7432,7 @@
             <w:sz w:val="24"/>
             <w:szCs w:val="24"/>
           </w:rPr>
-          <w:t>7</w:t>
+          <w:t>6</w:t>
         </w:r>
         <w:r>
           <w:rPr>
@@ -7263,7 +7459,7 @@
           <w:szCs w:val="24"/>
         </w:rPr>
       </w:pPr>
-      <w:hyperlink w:anchor="_Toc239060560" w:history="1">
+      <w:hyperlink w:anchor="_Toc239152324" w:history="1">
         <w:r>
           <w:rPr>
             <w:rStyle w:val="Lienhypertexte"/>
@@ -7274,7 +7470,7 @@
             <w:sz w:val="24"/>
             <w:szCs w:val="24"/>
           </w:rPr>
-          <w:t>5.6 UC6</w:t>
+          <w:t>5.3 UC3</w:t>
         </w:r>
         <w:r>
           <w:rPr>
@@ -7301,7 +7497,7 @@
             <w:sz w:val="24"/>
             <w:szCs w:val="24"/>
           </w:rPr>
-          <w:instrText xml:space="preserve"> PAGEREF _Toc239060560 \h </w:instrText>
+          <w:instrText xml:space="preserve"> PAGEREF _Toc239152324 \h </w:instrText>
         </w:r>
         <w:r>
           <w:rPr>
@@ -7327,7 +7523,7 @@
             <w:sz w:val="24"/>
             <w:szCs w:val="24"/>
           </w:rPr>
-          <w:t>8</w:t>
+          <w:t>6</w:t>
         </w:r>
         <w:r>
           <w:rPr>
@@ -7354,7 +7550,7 @@
           <w:szCs w:val="24"/>
         </w:rPr>
       </w:pPr>
-      <w:hyperlink w:anchor="_Toc239060561" w:history="1">
+      <w:hyperlink w:anchor="_Toc239152325" w:history="1">
         <w:r>
           <w:rPr>
             <w:rStyle w:val="Lienhypertexte"/>
@@ -7365,7 +7561,7 @@
             <w:sz w:val="24"/>
             <w:szCs w:val="24"/>
           </w:rPr>
-          <w:t>5.7 UC7</w:t>
+          <w:t>5.4 UC4</w:t>
         </w:r>
         <w:r>
           <w:rPr>
@@ -7392,7 +7588,7 @@
             <w:sz w:val="24"/>
             <w:szCs w:val="24"/>
           </w:rPr>
-          <w:instrText xml:space="preserve"> PAGEREF _Toc239060561 \h </w:instrText>
+          <w:instrText xml:space="preserve"> PAGEREF _Toc239152325 \h </w:instrText>
         </w:r>
         <w:r>
           <w:rPr>
@@ -7418,7 +7614,7 @@
             <w:sz w:val="24"/>
             <w:szCs w:val="24"/>
           </w:rPr>
-          <w:t>9</w:t>
+          <w:t>7</w:t>
         </w:r>
         <w:r>
           <w:rPr>
@@ -7433,7 +7629,7 @@
     </w:p>
     <w:p>
       <w:pPr>
-        <w:pStyle w:val="TM1"/>
+        <w:pStyle w:val="TM2"/>
         <w:tabs>
           <w:tab w:val="right" w:leader="dot" w:pos="9628"/>
         </w:tabs>
@@ -7445,119 +7641,7 @@
           <w:szCs w:val="24"/>
         </w:rPr>
       </w:pPr>
-      <w:hyperlink w:anchor="_Toc239060562" w:history="1">
-        <w:r>
-          <w:rPr>
-            <w:rStyle w:val="Lienhypertexte"/>
-            <w:b/>
-            <w:bCs/>
-            <w:noProof/>
-            <w:sz w:val="24"/>
-            <w:szCs w:val="24"/>
-          </w:rPr>
-          <w:t>6. Exigences n</w:t>
-        </w:r>
-        <w:r>
-          <w:rPr>
-            <w:rStyle w:val="Lienhypertexte"/>
-            <w:b/>
-            <w:bCs/>
-            <w:noProof/>
-            <w:sz w:val="24"/>
-            <w:szCs w:val="24"/>
-          </w:rPr>
-          <w:t>o</w:t>
-        </w:r>
-        <w:r>
-          <w:rPr>
-            <w:rStyle w:val="Lienhypertexte"/>
-            <w:b/>
-            <w:bCs/>
-            <w:noProof/>
-            <w:sz w:val="24"/>
-            <w:szCs w:val="24"/>
-          </w:rPr>
-          <w:t>n fonctionnelles</w:t>
-        </w:r>
-        <w:r>
-          <w:rPr>
-            <w:noProof/>
-            <w:webHidden/>
-            <w:sz w:val="24"/>
-            <w:szCs w:val="24"/>
-          </w:rPr>
-          <w:tab/>
-        </w:r>
-        <w:r>
-          <w:rPr>
-            <w:noProof/>
-            <w:webHidden/>
-            <w:sz w:val="24"/>
-            <w:szCs w:val="24"/>
-          </w:rPr>
-          <w:fldChar w:fldCharType="begin"/>
-        </w:r>
-        <w:r>
-          <w:rPr>
-            <w:noProof/>
-            <w:webHidden/>
-            <w:sz w:val="24"/>
-            <w:szCs w:val="24"/>
-          </w:rPr>
-          <w:instrText xml:space="preserve"> PAGEREF _Toc239060562 \h </w:instrText>
-        </w:r>
-        <w:r>
-          <w:rPr>
-            <w:noProof/>
-            <w:webHidden/>
-            <w:sz w:val="24"/>
-            <w:szCs w:val="24"/>
-          </w:rPr>
-        </w:r>
-        <w:r>
-          <w:rPr>
-            <w:noProof/>
-            <w:webHidden/>
-            <w:sz w:val="24"/>
-            <w:szCs w:val="24"/>
-          </w:rPr>
-          <w:fldChar w:fldCharType="separate"/>
-        </w:r>
-        <w:r>
-          <w:rPr>
-            <w:noProof/>
-            <w:webHidden/>
-            <w:sz w:val="24"/>
-            <w:szCs w:val="24"/>
-          </w:rPr>
-          <w:t>9</w:t>
-        </w:r>
-        <w:r>
-          <w:rPr>
-            <w:noProof/>
-            <w:webHidden/>
-            <w:sz w:val="24"/>
-            <w:szCs w:val="24"/>
-          </w:rPr>
-          <w:fldChar w:fldCharType="end"/>
-        </w:r>
-      </w:hyperlink>
-    </w:p>
-    <w:p>
-      <w:pPr>
-        <w:pStyle w:val="TM1"/>
-        <w:tabs>
-          <w:tab w:val="right" w:leader="dot" w:pos="9628"/>
-        </w:tabs>
-        <w:spacing w:line="360" w:lineRule="auto"/>
-        <w:rPr>
-          <w:rFonts w:asciiTheme="minorHAnsi" w:eastAsiaTheme="minorEastAsia" w:hAnsiTheme="minorHAnsi" w:cstheme="minorBidi"/>
-          <w:noProof/>
-          <w:sz w:val="24"/>
-          <w:szCs w:val="24"/>
-        </w:rPr>
-      </w:pPr>
-      <w:hyperlink w:anchor="_Toc239060563" w:history="1">
+      <w:hyperlink w:anchor="_Toc239152326" w:history="1">
         <w:r>
           <w:rPr>
             <w:rStyle w:val="Lienhypertexte"/>
@@ -7568,6 +7652,369 @@
             <w:sz w:val="24"/>
             <w:szCs w:val="24"/>
           </w:rPr>
+          <w:t>5.5 UC5</w:t>
+        </w:r>
+        <w:r>
+          <w:rPr>
+            <w:noProof/>
+            <w:webHidden/>
+            <w:sz w:val="24"/>
+            <w:szCs w:val="24"/>
+          </w:rPr>
+          <w:tab/>
+        </w:r>
+        <w:r>
+          <w:rPr>
+            <w:noProof/>
+            <w:webHidden/>
+            <w:sz w:val="24"/>
+            <w:szCs w:val="24"/>
+          </w:rPr>
+          <w:fldChar w:fldCharType="begin"/>
+        </w:r>
+        <w:r>
+          <w:rPr>
+            <w:noProof/>
+            <w:webHidden/>
+            <w:sz w:val="24"/>
+            <w:szCs w:val="24"/>
+          </w:rPr>
+          <w:instrText xml:space="preserve"> PAGEREF _Toc239152326 \h </w:instrText>
+        </w:r>
+        <w:r>
+          <w:rPr>
+            <w:noProof/>
+            <w:webHidden/>
+            <w:sz w:val="24"/>
+            <w:szCs w:val="24"/>
+          </w:rPr>
+        </w:r>
+        <w:r>
+          <w:rPr>
+            <w:noProof/>
+            <w:webHidden/>
+            <w:sz w:val="24"/>
+            <w:szCs w:val="24"/>
+          </w:rPr>
+          <w:fldChar w:fldCharType="separate"/>
+        </w:r>
+        <w:r>
+          <w:rPr>
+            <w:noProof/>
+            <w:webHidden/>
+            <w:sz w:val="24"/>
+            <w:szCs w:val="24"/>
+          </w:rPr>
+          <w:t>7</w:t>
+        </w:r>
+        <w:r>
+          <w:rPr>
+            <w:noProof/>
+            <w:webHidden/>
+            <w:sz w:val="24"/>
+            <w:szCs w:val="24"/>
+          </w:rPr>
+          <w:fldChar w:fldCharType="end"/>
+        </w:r>
+      </w:hyperlink>
+    </w:p>
+    <w:p>
+      <w:pPr>
+        <w:pStyle w:val="TM2"/>
+        <w:tabs>
+          <w:tab w:val="right" w:leader="dot" w:pos="9628"/>
+        </w:tabs>
+        <w:spacing w:line="360" w:lineRule="auto"/>
+        <w:rPr>
+          <w:rFonts w:asciiTheme="minorHAnsi" w:eastAsiaTheme="minorEastAsia" w:hAnsiTheme="minorHAnsi" w:cstheme="minorBidi"/>
+          <w:noProof/>
+          <w:sz w:val="24"/>
+          <w:szCs w:val="24"/>
+        </w:rPr>
+      </w:pPr>
+      <w:hyperlink w:anchor="_Toc239152327" w:history="1">
+        <w:r>
+          <w:rPr>
+            <w:rStyle w:val="Lienhypertexte"/>
+            <w:rFonts w:eastAsia="Calibri"/>
+            <w:b/>
+            <w:bCs/>
+            <w:noProof/>
+            <w:sz w:val="24"/>
+            <w:szCs w:val="24"/>
+          </w:rPr>
+          <w:t>5.6 UC6</w:t>
+        </w:r>
+        <w:r>
+          <w:rPr>
+            <w:noProof/>
+            <w:webHidden/>
+            <w:sz w:val="24"/>
+            <w:szCs w:val="24"/>
+          </w:rPr>
+          <w:tab/>
+        </w:r>
+        <w:r>
+          <w:rPr>
+            <w:noProof/>
+            <w:webHidden/>
+            <w:sz w:val="24"/>
+            <w:szCs w:val="24"/>
+          </w:rPr>
+          <w:fldChar w:fldCharType="begin"/>
+        </w:r>
+        <w:r>
+          <w:rPr>
+            <w:noProof/>
+            <w:webHidden/>
+            <w:sz w:val="24"/>
+            <w:szCs w:val="24"/>
+          </w:rPr>
+          <w:instrText xml:space="preserve"> PAGEREF _Toc239152327 \h </w:instrText>
+        </w:r>
+        <w:r>
+          <w:rPr>
+            <w:noProof/>
+            <w:webHidden/>
+            <w:sz w:val="24"/>
+            <w:szCs w:val="24"/>
+          </w:rPr>
+        </w:r>
+        <w:r>
+          <w:rPr>
+            <w:noProof/>
+            <w:webHidden/>
+            <w:sz w:val="24"/>
+            <w:szCs w:val="24"/>
+          </w:rPr>
+          <w:fldChar w:fldCharType="separate"/>
+        </w:r>
+        <w:r>
+          <w:rPr>
+            <w:noProof/>
+            <w:webHidden/>
+            <w:sz w:val="24"/>
+            <w:szCs w:val="24"/>
+          </w:rPr>
+          <w:t>8</w:t>
+        </w:r>
+        <w:r>
+          <w:rPr>
+            <w:noProof/>
+            <w:webHidden/>
+            <w:sz w:val="24"/>
+            <w:szCs w:val="24"/>
+          </w:rPr>
+          <w:fldChar w:fldCharType="end"/>
+        </w:r>
+      </w:hyperlink>
+    </w:p>
+    <w:p>
+      <w:pPr>
+        <w:pStyle w:val="TM2"/>
+        <w:tabs>
+          <w:tab w:val="right" w:leader="dot" w:pos="9628"/>
+        </w:tabs>
+        <w:spacing w:line="360" w:lineRule="auto"/>
+        <w:rPr>
+          <w:rFonts w:asciiTheme="minorHAnsi" w:eastAsiaTheme="minorEastAsia" w:hAnsiTheme="minorHAnsi" w:cstheme="minorBidi"/>
+          <w:noProof/>
+          <w:sz w:val="24"/>
+          <w:szCs w:val="24"/>
+        </w:rPr>
+      </w:pPr>
+      <w:hyperlink w:anchor="_Toc239152328" w:history="1">
+        <w:r>
+          <w:rPr>
+            <w:rStyle w:val="Lienhypertexte"/>
+            <w:rFonts w:eastAsia="Calibri"/>
+            <w:b/>
+            <w:bCs/>
+            <w:noProof/>
+            <w:sz w:val="24"/>
+            <w:szCs w:val="24"/>
+          </w:rPr>
+          <w:t>5.7 UC7</w:t>
+        </w:r>
+        <w:r>
+          <w:rPr>
+            <w:noProof/>
+            <w:webHidden/>
+            <w:sz w:val="24"/>
+            <w:szCs w:val="24"/>
+          </w:rPr>
+          <w:tab/>
+        </w:r>
+        <w:r>
+          <w:rPr>
+            <w:noProof/>
+            <w:webHidden/>
+            <w:sz w:val="24"/>
+            <w:szCs w:val="24"/>
+          </w:rPr>
+          <w:fldChar w:fldCharType="begin"/>
+        </w:r>
+        <w:r>
+          <w:rPr>
+            <w:noProof/>
+            <w:webHidden/>
+            <w:sz w:val="24"/>
+            <w:szCs w:val="24"/>
+          </w:rPr>
+          <w:instrText xml:space="preserve"> PAGEREF _Toc239152328 \h </w:instrText>
+        </w:r>
+        <w:r>
+          <w:rPr>
+            <w:noProof/>
+            <w:webHidden/>
+            <w:sz w:val="24"/>
+            <w:szCs w:val="24"/>
+          </w:rPr>
+        </w:r>
+        <w:r>
+          <w:rPr>
+            <w:noProof/>
+            <w:webHidden/>
+            <w:sz w:val="24"/>
+            <w:szCs w:val="24"/>
+          </w:rPr>
+          <w:fldChar w:fldCharType="separate"/>
+        </w:r>
+        <w:r>
+          <w:rPr>
+            <w:noProof/>
+            <w:webHidden/>
+            <w:sz w:val="24"/>
+            <w:szCs w:val="24"/>
+          </w:rPr>
+          <w:t>9</w:t>
+        </w:r>
+        <w:r>
+          <w:rPr>
+            <w:noProof/>
+            <w:webHidden/>
+            <w:sz w:val="24"/>
+            <w:szCs w:val="24"/>
+          </w:rPr>
+          <w:fldChar w:fldCharType="end"/>
+        </w:r>
+      </w:hyperlink>
+    </w:p>
+    <w:p>
+      <w:pPr>
+        <w:pStyle w:val="TM1"/>
+        <w:tabs>
+          <w:tab w:val="right" w:leader="dot" w:pos="9628"/>
+        </w:tabs>
+        <w:spacing w:line="360" w:lineRule="auto"/>
+        <w:rPr>
+          <w:rFonts w:asciiTheme="minorHAnsi" w:eastAsiaTheme="minorEastAsia" w:hAnsiTheme="minorHAnsi" w:cstheme="minorBidi"/>
+          <w:noProof/>
+          <w:sz w:val="24"/>
+          <w:szCs w:val="24"/>
+        </w:rPr>
+      </w:pPr>
+      <w:hyperlink w:anchor="_Toc239152329" w:history="1">
+        <w:r>
+          <w:rPr>
+            <w:rStyle w:val="Lienhypertexte"/>
+            <w:b/>
+            <w:bCs/>
+            <w:noProof/>
+            <w:sz w:val="24"/>
+            <w:szCs w:val="24"/>
+          </w:rPr>
+          <w:t>6. Exigences non fonctionnelles</w:t>
+        </w:r>
+        <w:r>
+          <w:rPr>
+            <w:noProof/>
+            <w:webHidden/>
+            <w:sz w:val="24"/>
+            <w:szCs w:val="24"/>
+          </w:rPr>
+          <w:tab/>
+        </w:r>
+        <w:r>
+          <w:rPr>
+            <w:noProof/>
+            <w:webHidden/>
+            <w:sz w:val="24"/>
+            <w:szCs w:val="24"/>
+          </w:rPr>
+          <w:fldChar w:fldCharType="begin"/>
+        </w:r>
+        <w:r>
+          <w:rPr>
+            <w:noProof/>
+            <w:webHidden/>
+            <w:sz w:val="24"/>
+            <w:szCs w:val="24"/>
+          </w:rPr>
+          <w:instrText xml:space="preserve"> PAGEREF _Toc239152329 \h </w:instrText>
+        </w:r>
+        <w:r>
+          <w:rPr>
+            <w:noProof/>
+            <w:webHidden/>
+            <w:sz w:val="24"/>
+            <w:szCs w:val="24"/>
+          </w:rPr>
+        </w:r>
+        <w:r>
+          <w:rPr>
+            <w:noProof/>
+            <w:webHidden/>
+            <w:sz w:val="24"/>
+            <w:szCs w:val="24"/>
+          </w:rPr>
+          <w:fldChar w:fldCharType="separate"/>
+        </w:r>
+        <w:r>
+          <w:rPr>
+            <w:noProof/>
+            <w:webHidden/>
+            <w:sz w:val="24"/>
+            <w:szCs w:val="24"/>
+          </w:rPr>
+          <w:t>10</w:t>
+        </w:r>
+        <w:r>
+          <w:rPr>
+            <w:noProof/>
+            <w:webHidden/>
+            <w:sz w:val="24"/>
+            <w:szCs w:val="24"/>
+          </w:rPr>
+          <w:fldChar w:fldCharType="end"/>
+        </w:r>
+      </w:hyperlink>
+    </w:p>
+    <w:p>
+      <w:pPr>
+        <w:pStyle w:val="TM1"/>
+        <w:tabs>
+          <w:tab w:val="right" w:leader="dot" w:pos="9628"/>
+        </w:tabs>
+        <w:spacing w:line="360" w:lineRule="auto"/>
+        <w:rPr>
+          <w:rFonts w:asciiTheme="minorHAnsi" w:eastAsiaTheme="minorEastAsia" w:hAnsiTheme="minorHAnsi" w:cstheme="minorBidi"/>
+          <w:noProof/>
+          <w:sz w:val="24"/>
+          <w:szCs w:val="24"/>
+        </w:rPr>
+      </w:pPr>
+      <w:hyperlink w:anchor="_Toc239152330" w:history="1">
+        <w:r>
+          <w:rPr>
+            <w:rStyle w:val="Lienhypertexte"/>
+            <w:rFonts w:eastAsia="Calibri"/>
+            <w:b/>
+            <w:bCs/>
+            <w:noProof/>
+            <w:sz w:val="24"/>
+            <w:szCs w:val="24"/>
+          </w:rPr>
           <w:t>Table des matières</w:t>
         </w:r>
         <w:r>
@@ -7595,7 +8042,7 @@
             <w:sz w:val="24"/>
             <w:szCs w:val="24"/>
           </w:rPr>
-          <w:instrText xml:space="preserve"> PAGEREF _Toc239060563 \h </w:instrText>
+          <w:instrText xml:space="preserve"> PAGEREF _Toc239152330 \h </w:instrText>
         </w:r>
         <w:r>
           <w:rPr>
@@ -11046,7 +11493,7 @@
   <w:style w:type="paragraph" w:default="1" w:styleId="Normal">
     <w:name w:val="Normal"/>
     <w:qFormat/>
-    <w:rsid w:val="007C17DF"/>
+    <w:rsid w:val="00E375EF"/>
   </w:style>
   <w:style w:type="paragraph" w:styleId="Titre1">
     <w:name w:val="heading 1"/>

</xml_diff>